<commit_message>
Inventaire Esmat : protège-matelas, clés, vaisselle et cintres corrigés
Co-Authored-By: Claude Opus 5.5 <noreply@anthropic.com>
Claude-Session: https://claude.ai/code/session_01RQKYxRKBDaebpwUM3RJinb
</commit_message>
<xml_diff>
--- a/inventaire/Inventaire_Etat_des_lieux_Esmat_ROSHANGAR_2026-09-01.docx
+++ b/inventaire/Inventaire_Etat_des_lieux_Esmat_ROSHANGAR_2026-09-01.docx
@@ -3968,7 +3968,7 @@
                 <w:sz w:val="15"/>
                 <w:szCs w:val="15"/>
               </w:rPr>
-              <w:t xml:space="preserve">Traces sur la plaque de droite</w:t>
+              <w:t xml:space="preserve">Traces incrustées sur les deux plaques</w:t>
             </w:r>
           </w:p>
         </w:tc>
@@ -5542,7 +5542,7 @@
                 <w:sz w:val="20"/>
                 <w:szCs w:val="20"/>
               </w:rPr>
-              <w:t xml:space="preserve">Assiettes x4 (2 jaunes, 1 rose, 1 blanche)</w:t>
+              <w:t xml:space="preserve">Assiette x1 (rose)</w:t>
             </w:r>
           </w:p>
         </w:tc>
@@ -5973,7 +5973,7 @@
                 <w:sz w:val="20"/>
                 <w:szCs w:val="20"/>
               </w:rPr>
-              <w:t xml:space="preserve">Couverts : 2 fourchettes, 2 cuillères à soupe, 2 couteaux, 2 cuillères à café</w:t>
+              <w:t xml:space="preserve">Couverts : 2 fourchettes, 1 cuillère à soupe, 2 couteaux, 2 cuillères à café</w:t>
             </w:r>
           </w:p>
         </w:tc>
@@ -7266,7 +7266,7 @@
                 <w:sz w:val="20"/>
                 <w:szCs w:val="20"/>
               </w:rPr>
-              <w:t xml:space="preserve">Panier de douche</w:t>
+              <w:t xml:space="preserve">WC</w:t>
             </w:r>
           </w:p>
         </w:tc>
@@ -7288,22 +7288,6 @@
             <w:vAlign w:val="center"/>
           </w:tcPr>
           <w:p>
-            <w:r>
-              <w:rPr>
-                <w:rFonts w:ascii="Times New Roman" w:cs="Times New Roman" w:eastAsia="Times New Roman" w:hAnsi="Times New Roman"/>
-                <w:sz w:val="20"/>
-                <w:szCs w:val="20"/>
-              </w:rPr>
-              <w:t xml:space="preserve">☐ Bon</w:t>
-            </w:r>
-            <w:r>
-              <w:rPr>
-                <w:rFonts w:ascii="Times New Roman" w:cs="Times New Roman" w:eastAsia="Times New Roman" w:hAnsi="Times New Roman"/>
-                <w:sz w:val="20"/>
-                <w:szCs w:val="20"/>
-              </w:rPr>
-              <w:t xml:space="preserve"> </w:t>
-            </w:r>
             <w:r>
               <w:rPr>
                 <w:rFonts w:ascii="Times New Roman" w:cs="Times New Roman" w:eastAsia="Times New Roman" w:hAnsi="Times New Roman"/>
@@ -7312,7 +7296,23 @@
                 <w:sz w:val="20"/>
                 <w:szCs w:val="20"/>
               </w:rPr>
-              <w:t xml:space="preserve">X Usage</w:t>
+              <w:t xml:space="preserve">X Bon</w:t>
+            </w:r>
+            <w:r>
+              <w:rPr>
+                <w:rFonts w:ascii="Times New Roman" w:cs="Times New Roman" w:eastAsia="Times New Roman" w:hAnsi="Times New Roman"/>
+                <w:sz w:val="20"/>
+                <w:szCs w:val="20"/>
+              </w:rPr>
+              <w:t xml:space="preserve"> </w:t>
+            </w:r>
+            <w:r>
+              <w:rPr>
+                <w:rFonts w:ascii="Times New Roman" w:cs="Times New Roman" w:eastAsia="Times New Roman" w:hAnsi="Times New Roman"/>
+                <w:sz w:val="20"/>
+                <w:szCs w:val="20"/>
+              </w:rPr>
+              <w:t xml:space="preserve">☐ Usage</w:t>
             </w:r>
             <w:r>
               <w:rPr>
@@ -7416,7 +7416,7 @@
                 <w:sz w:val="15"/>
                 <w:szCs w:val="15"/>
               </w:rPr>
-              <w:t xml:space="preserve">Une des accroches du panier est cassée</w:t>
+              <w:t xml:space="preserve">RAS</w:t>
             </w:r>
           </w:p>
         </w:tc>
@@ -7481,7 +7481,7 @@
                 <w:sz w:val="20"/>
                 <w:szCs w:val="20"/>
               </w:rPr>
-              <w:t xml:space="preserve">WC</w:t>
+              <w:t xml:space="preserve">Miroir</w:t>
             </w:r>
           </w:p>
         </w:tc>
@@ -7697,7 +7697,7 @@
                 <w:sz w:val="20"/>
                 <w:szCs w:val="20"/>
               </w:rPr>
-              <w:t xml:space="preserve">Miroir</w:t>
+              <w:t xml:space="preserve">Tapis</w:t>
             </w:r>
           </w:p>
         </w:tc>
@@ -7912,7 +7912,7 @@
                 <w:sz w:val="20"/>
                 <w:szCs w:val="20"/>
               </w:rPr>
-              <w:t xml:space="preserve">Tapis</w:t>
+              <w:t xml:space="preserve">Machine à laver</w:t>
             </w:r>
           </w:p>
         </w:tc>
@@ -8128,7 +8128,7 @@
                 <w:sz w:val="20"/>
                 <w:szCs w:val="20"/>
               </w:rPr>
-              <w:t xml:space="preserve">Machine à laver</w:t>
+              <w:t xml:space="preserve">Porte</w:t>
             </w:r>
           </w:p>
         </w:tc>
@@ -8150,6 +8150,22 @@
             <w:vAlign w:val="center"/>
           </w:tcPr>
           <w:p>
+            <w:r>
+              <w:rPr>
+                <w:rFonts w:ascii="Times New Roman" w:cs="Times New Roman" w:eastAsia="Times New Roman" w:hAnsi="Times New Roman"/>
+                <w:sz w:val="20"/>
+                <w:szCs w:val="20"/>
+              </w:rPr>
+              <w:t xml:space="preserve">☐ Bon</w:t>
+            </w:r>
+            <w:r>
+              <w:rPr>
+                <w:rFonts w:ascii="Times New Roman" w:cs="Times New Roman" w:eastAsia="Times New Roman" w:hAnsi="Times New Roman"/>
+                <w:sz w:val="20"/>
+                <w:szCs w:val="20"/>
+              </w:rPr>
+              <w:t xml:space="preserve"> </w:t>
+            </w:r>
             <w:r>
               <w:rPr>
                 <w:rFonts w:ascii="Times New Roman" w:cs="Times New Roman" w:eastAsia="Times New Roman" w:hAnsi="Times New Roman"/>
@@ -8158,23 +8174,7 @@
                 <w:sz w:val="20"/>
                 <w:szCs w:val="20"/>
               </w:rPr>
-              <w:t xml:space="preserve">X Bon</w:t>
-            </w:r>
-            <w:r>
-              <w:rPr>
-                <w:rFonts w:ascii="Times New Roman" w:cs="Times New Roman" w:eastAsia="Times New Roman" w:hAnsi="Times New Roman"/>
-                <w:sz w:val="20"/>
-                <w:szCs w:val="20"/>
-              </w:rPr>
-              <w:t xml:space="preserve"> </w:t>
-            </w:r>
-            <w:r>
-              <w:rPr>
-                <w:rFonts w:ascii="Times New Roman" w:cs="Times New Roman" w:eastAsia="Times New Roman" w:hAnsi="Times New Roman"/>
-                <w:sz w:val="20"/>
-                <w:szCs w:val="20"/>
-              </w:rPr>
-              <w:t xml:space="preserve">☐ Usage</w:t>
+              <w:t xml:space="preserve">X Usage</w:t>
             </w:r>
             <w:r>
               <w:rPr>
@@ -8278,7 +8278,7 @@
                 <w:sz w:val="15"/>
                 <w:szCs w:val="15"/>
               </w:rPr>
-              <w:t xml:space="preserve">RAS</w:t>
+              <w:t xml:space="preserve">Légères craquelures de peinture</w:t>
             </w:r>
           </w:p>
         </w:tc>
@@ -8343,7 +8343,7 @@
                 <w:sz w:val="20"/>
                 <w:szCs w:val="20"/>
               </w:rPr>
-              <w:t xml:space="preserve">Porte</w:t>
+              <w:t xml:space="preserve">Murs</w:t>
             </w:r>
           </w:p>
         </w:tc>
@@ -8496,7 +8496,7 @@
                 <w:sz w:val="15"/>
                 <w:szCs w:val="15"/>
               </w:rPr>
-              <w:t xml:space="preserve">Légères craquelures de peinture</w:t>
+              <w:t xml:space="preserve">Trois impacts visibles sur le mur derrière la porte</w:t>
             </w:r>
           </w:p>
         </w:tc>
@@ -8559,7 +8559,7 @@
                 <w:sz w:val="20"/>
                 <w:szCs w:val="20"/>
               </w:rPr>
-              <w:t xml:space="preserve">Murs</w:t>
+              <w:t xml:space="preserve">Plafond</w:t>
             </w:r>
           </w:p>
         </w:tc>
@@ -8709,7 +8709,7 @@
                 <w:sz w:val="15"/>
                 <w:szCs w:val="15"/>
               </w:rPr>
-              <w:t xml:space="preserve">Trois impacts visibles sur le mur derrière la porte</w:t>
+              <w:t xml:space="preserve">Légères craquelures de peinture</w:t>
             </w:r>
           </w:p>
         </w:tc>
@@ -8745,7 +8745,7 @@
                 <w:sz w:val="20"/>
                 <w:szCs w:val="20"/>
               </w:rPr>
-              <w:t xml:space="preserve"/>
+              <w:t xml:space="preserve">Chambre 2 (côté sdb)</w:t>
             </w:r>
           </w:p>
         </w:tc>
@@ -8774,7 +8774,7 @@
                 <w:sz w:val="20"/>
                 <w:szCs w:val="20"/>
               </w:rPr>
-              <w:t xml:space="preserve">Plafond</w:t>
+              <w:t xml:space="preserve">Porte</w:t>
             </w:r>
           </w:p>
         </w:tc>
@@ -8962,7 +8962,7 @@
                 <w:sz w:val="20"/>
                 <w:szCs w:val="20"/>
               </w:rPr>
-              <w:t xml:space="preserve">Chambre 2 (côté sdb)</w:t>
+              <w:t xml:space="preserve"/>
             </w:r>
           </w:p>
         </w:tc>
@@ -8990,7 +8990,7 @@
                 <w:sz w:val="20"/>
                 <w:szCs w:val="20"/>
               </w:rPr>
-              <w:t xml:space="preserve">Porte</w:t>
+              <w:t xml:space="preserve">Murs</w:t>
             </w:r>
           </w:p>
         </w:tc>
@@ -9012,22 +9012,6 @@
             <w:vAlign w:val="center"/>
           </w:tcPr>
           <w:p>
-            <w:r>
-              <w:rPr>
-                <w:rFonts w:ascii="Times New Roman" w:cs="Times New Roman" w:eastAsia="Times New Roman" w:hAnsi="Times New Roman"/>
-                <w:sz w:val="20"/>
-                <w:szCs w:val="20"/>
-              </w:rPr>
-              <w:t xml:space="preserve">☐ Bon</w:t>
-            </w:r>
-            <w:r>
-              <w:rPr>
-                <w:rFonts w:ascii="Times New Roman" w:cs="Times New Roman" w:eastAsia="Times New Roman" w:hAnsi="Times New Roman"/>
-                <w:sz w:val="20"/>
-                <w:szCs w:val="20"/>
-              </w:rPr>
-              <w:t xml:space="preserve"> </w:t>
-            </w:r>
             <w:r>
               <w:rPr>
                 <w:rFonts w:ascii="Times New Roman" w:cs="Times New Roman" w:eastAsia="Times New Roman" w:hAnsi="Times New Roman"/>
@@ -9036,7 +9020,23 @@
                 <w:sz w:val="20"/>
                 <w:szCs w:val="20"/>
               </w:rPr>
-              <w:t xml:space="preserve">X Usage</w:t>
+              <w:t xml:space="preserve">X Bon</w:t>
+            </w:r>
+            <w:r>
+              <w:rPr>
+                <w:rFonts w:ascii="Times New Roman" w:cs="Times New Roman" w:eastAsia="Times New Roman" w:hAnsi="Times New Roman"/>
+                <w:sz w:val="20"/>
+                <w:szCs w:val="20"/>
+              </w:rPr>
+              <w:t xml:space="preserve"> </w:t>
+            </w:r>
+            <w:r>
+              <w:rPr>
+                <w:rFonts w:ascii="Times New Roman" w:cs="Times New Roman" w:eastAsia="Times New Roman" w:hAnsi="Times New Roman"/>
+                <w:sz w:val="20"/>
+                <w:szCs w:val="20"/>
+              </w:rPr>
+              <w:t xml:space="preserve">☐ Usage</w:t>
             </w:r>
             <w:r>
               <w:rPr>
@@ -9140,7 +9140,7 @@
                 <w:sz w:val="15"/>
                 <w:szCs w:val="15"/>
               </w:rPr>
-              <w:t xml:space="preserve">Légères craquelures de peinture</w:t>
+              <w:t xml:space="preserve">RAS</w:t>
             </w:r>
           </w:p>
         </w:tc>
@@ -9205,7 +9205,7 @@
                 <w:sz w:val="20"/>
                 <w:szCs w:val="20"/>
               </w:rPr>
-              <w:t xml:space="preserve">Murs</w:t>
+              <w:t xml:space="preserve">Plafond</w:t>
             </w:r>
           </w:p>
         </w:tc>
@@ -9228,6 +9228,22 @@
             <w:vAlign w:val="center"/>
           </w:tcPr>
           <w:p>
+            <w:r>
+              <w:rPr>
+                <w:rFonts w:ascii="Times New Roman" w:cs="Times New Roman" w:eastAsia="Times New Roman" w:hAnsi="Times New Roman"/>
+                <w:sz w:val="20"/>
+                <w:szCs w:val="20"/>
+              </w:rPr>
+              <w:t xml:space="preserve">☐ Bon</w:t>
+            </w:r>
+            <w:r>
+              <w:rPr>
+                <w:rFonts w:ascii="Times New Roman" w:cs="Times New Roman" w:eastAsia="Times New Roman" w:hAnsi="Times New Roman"/>
+                <w:sz w:val="20"/>
+                <w:szCs w:val="20"/>
+              </w:rPr>
+              <w:t xml:space="preserve"> </w:t>
+            </w:r>
             <w:r>
               <w:rPr>
                 <w:rFonts w:ascii="Times New Roman" w:cs="Times New Roman" w:eastAsia="Times New Roman" w:hAnsi="Times New Roman"/>
@@ -9236,23 +9252,7 @@
                 <w:sz w:val="20"/>
                 <w:szCs w:val="20"/>
               </w:rPr>
-              <w:t xml:space="preserve">X Bon</w:t>
-            </w:r>
-            <w:r>
-              <w:rPr>
-                <w:rFonts w:ascii="Times New Roman" w:cs="Times New Roman" w:eastAsia="Times New Roman" w:hAnsi="Times New Roman"/>
-                <w:sz w:val="20"/>
-                <w:szCs w:val="20"/>
-              </w:rPr>
-              <w:t xml:space="preserve"> </w:t>
-            </w:r>
-            <w:r>
-              <w:rPr>
-                <w:rFonts w:ascii="Times New Roman" w:cs="Times New Roman" w:eastAsia="Times New Roman" w:hAnsi="Times New Roman"/>
-                <w:sz w:val="20"/>
-                <w:szCs w:val="20"/>
-              </w:rPr>
-              <w:t xml:space="preserve">☐ Usage</w:t>
+              <w:t xml:space="preserve">X Usage</w:t>
             </w:r>
             <w:r>
               <w:rPr>
@@ -9358,7 +9358,7 @@
                 <w:sz w:val="15"/>
                 <w:szCs w:val="15"/>
               </w:rPr>
-              <w:t xml:space="preserve">RAS</w:t>
+              <w:t xml:space="preserve">Légères craquelures de peinture</w:t>
             </w:r>
           </w:p>
         </w:tc>
@@ -9421,7 +9421,7 @@
                 <w:sz w:val="20"/>
                 <w:szCs w:val="20"/>
               </w:rPr>
-              <w:t xml:space="preserve">Plafond</w:t>
+              <w:t xml:space="preserve">Sol (parquet)</w:t>
             </w:r>
           </w:p>
         </w:tc>
@@ -9443,22 +9443,6 @@
             <w:vAlign w:val="center"/>
           </w:tcPr>
           <w:p>
-            <w:r>
-              <w:rPr>
-                <w:rFonts w:ascii="Times New Roman" w:cs="Times New Roman" w:eastAsia="Times New Roman" w:hAnsi="Times New Roman"/>
-                <w:sz w:val="20"/>
-                <w:szCs w:val="20"/>
-              </w:rPr>
-              <w:t xml:space="preserve">☐ Bon</w:t>
-            </w:r>
-            <w:r>
-              <w:rPr>
-                <w:rFonts w:ascii="Times New Roman" w:cs="Times New Roman" w:eastAsia="Times New Roman" w:hAnsi="Times New Roman"/>
-                <w:sz w:val="20"/>
-                <w:szCs w:val="20"/>
-              </w:rPr>
-              <w:t xml:space="preserve"> </w:t>
-            </w:r>
             <w:r>
               <w:rPr>
                 <w:rFonts w:ascii="Times New Roman" w:cs="Times New Roman" w:eastAsia="Times New Roman" w:hAnsi="Times New Roman"/>
@@ -9467,7 +9451,23 @@
                 <w:sz w:val="20"/>
                 <w:szCs w:val="20"/>
               </w:rPr>
-              <w:t xml:space="preserve">X Usage</w:t>
+              <w:t xml:space="preserve">X Bon</w:t>
+            </w:r>
+            <w:r>
+              <w:rPr>
+                <w:rFonts w:ascii="Times New Roman" w:cs="Times New Roman" w:eastAsia="Times New Roman" w:hAnsi="Times New Roman"/>
+                <w:sz w:val="20"/>
+                <w:szCs w:val="20"/>
+              </w:rPr>
+              <w:t xml:space="preserve"> </w:t>
+            </w:r>
+            <w:r>
+              <w:rPr>
+                <w:rFonts w:ascii="Times New Roman" w:cs="Times New Roman" w:eastAsia="Times New Roman" w:hAnsi="Times New Roman"/>
+                <w:sz w:val="20"/>
+                <w:szCs w:val="20"/>
+              </w:rPr>
+              <w:t xml:space="preserve">☐ Usage</w:t>
             </w:r>
             <w:r>
               <w:rPr>
@@ -9571,7 +9571,7 @@
                 <w:sz w:val="15"/>
                 <w:szCs w:val="15"/>
               </w:rPr>
-              <w:t xml:space="preserve">Légères craquelures de peinture</w:t>
+              <w:t xml:space="preserve">RAS</w:t>
             </w:r>
           </w:p>
         </w:tc>
@@ -9636,7 +9636,7 @@
                 <w:sz w:val="20"/>
                 <w:szCs w:val="20"/>
               </w:rPr>
-              <w:t xml:space="preserve">Sol (parquet)</w:t>
+              <w:t xml:space="preserve">Volets</w:t>
             </w:r>
           </w:p>
         </w:tc>
@@ -9852,7 +9852,7 @@
                 <w:sz w:val="20"/>
                 <w:szCs w:val="20"/>
               </w:rPr>
-              <w:t xml:space="preserve">Volets</w:t>
+              <w:t xml:space="preserve">Rideaux occultants</w:t>
             </w:r>
           </w:p>
         </w:tc>
@@ -9874,6 +9874,22 @@
             <w:vAlign w:val="center"/>
           </w:tcPr>
           <w:p>
+            <w:r>
+              <w:rPr>
+                <w:rFonts w:ascii="Times New Roman" w:cs="Times New Roman" w:eastAsia="Times New Roman" w:hAnsi="Times New Roman"/>
+                <w:sz w:val="20"/>
+                <w:szCs w:val="20"/>
+              </w:rPr>
+              <w:t xml:space="preserve">☐ Bon</w:t>
+            </w:r>
+            <w:r>
+              <w:rPr>
+                <w:rFonts w:ascii="Times New Roman" w:cs="Times New Roman" w:eastAsia="Times New Roman" w:hAnsi="Times New Roman"/>
+                <w:sz w:val="20"/>
+                <w:szCs w:val="20"/>
+              </w:rPr>
+              <w:t xml:space="preserve"> </w:t>
+            </w:r>
             <w:r>
               <w:rPr>
                 <w:rFonts w:ascii="Times New Roman" w:cs="Times New Roman" w:eastAsia="Times New Roman" w:hAnsi="Times New Roman"/>
@@ -9882,23 +9898,7 @@
                 <w:sz w:val="20"/>
                 <w:szCs w:val="20"/>
               </w:rPr>
-              <w:t xml:space="preserve">X Bon</w:t>
-            </w:r>
-            <w:r>
-              <w:rPr>
-                <w:rFonts w:ascii="Times New Roman" w:cs="Times New Roman" w:eastAsia="Times New Roman" w:hAnsi="Times New Roman"/>
-                <w:sz w:val="20"/>
-                <w:szCs w:val="20"/>
-              </w:rPr>
-              <w:t xml:space="preserve"> </w:t>
-            </w:r>
-            <w:r>
-              <w:rPr>
-                <w:rFonts w:ascii="Times New Roman" w:cs="Times New Roman" w:eastAsia="Times New Roman" w:hAnsi="Times New Roman"/>
-                <w:sz w:val="20"/>
-                <w:szCs w:val="20"/>
-              </w:rPr>
-              <w:t xml:space="preserve">☐ Usage</w:t>
+              <w:t xml:space="preserve">X Usage</w:t>
             </w:r>
             <w:r>
               <w:rPr>
@@ -10002,7 +10002,7 @@
                 <w:sz w:val="15"/>
                 <w:szCs w:val="15"/>
               </w:rPr>
-              <w:t xml:space="preserve">RAS</w:t>
+              <w:t xml:space="preserve">Légère décoloration</w:t>
             </w:r>
           </w:p>
         </w:tc>
@@ -10067,7 +10067,7 @@
                 <w:sz w:val="20"/>
                 <w:szCs w:val="20"/>
               </w:rPr>
-              <w:t xml:space="preserve">Rideaux occultants</w:t>
+              <w:t xml:space="preserve">Lit</w:t>
             </w:r>
           </w:p>
         </w:tc>
@@ -10090,22 +10090,6 @@
             <w:vAlign w:val="center"/>
           </w:tcPr>
           <w:p>
-            <w:r>
-              <w:rPr>
-                <w:rFonts w:ascii="Times New Roman" w:cs="Times New Roman" w:eastAsia="Times New Roman" w:hAnsi="Times New Roman"/>
-                <w:sz w:val="20"/>
-                <w:szCs w:val="20"/>
-              </w:rPr>
-              <w:t xml:space="preserve">☐ Bon</w:t>
-            </w:r>
-            <w:r>
-              <w:rPr>
-                <w:rFonts w:ascii="Times New Roman" w:cs="Times New Roman" w:eastAsia="Times New Roman" w:hAnsi="Times New Roman"/>
-                <w:sz w:val="20"/>
-                <w:szCs w:val="20"/>
-              </w:rPr>
-              <w:t xml:space="preserve"> </w:t>
-            </w:r>
             <w:r>
               <w:rPr>
                 <w:rFonts w:ascii="Times New Roman" w:cs="Times New Roman" w:eastAsia="Times New Roman" w:hAnsi="Times New Roman"/>
@@ -10114,7 +10098,23 @@
                 <w:sz w:val="20"/>
                 <w:szCs w:val="20"/>
               </w:rPr>
-              <w:t xml:space="preserve">X Usage</w:t>
+              <w:t xml:space="preserve">X Bon</w:t>
+            </w:r>
+            <w:r>
+              <w:rPr>
+                <w:rFonts w:ascii="Times New Roman" w:cs="Times New Roman" w:eastAsia="Times New Roman" w:hAnsi="Times New Roman"/>
+                <w:sz w:val="20"/>
+                <w:szCs w:val="20"/>
+              </w:rPr>
+              <w:t xml:space="preserve"> </w:t>
+            </w:r>
+            <w:r>
+              <w:rPr>
+                <w:rFonts w:ascii="Times New Roman" w:cs="Times New Roman" w:eastAsia="Times New Roman" w:hAnsi="Times New Roman"/>
+                <w:sz w:val="20"/>
+                <w:szCs w:val="20"/>
+              </w:rPr>
+              <w:t xml:space="preserve">☐ Usage</w:t>
             </w:r>
             <w:r>
               <w:rPr>
@@ -10220,7 +10220,7 @@
                 <w:sz w:val="15"/>
                 <w:szCs w:val="15"/>
               </w:rPr>
-              <w:t xml:space="preserve">Légère décoloration</w:t>
+              <w:t xml:space="preserve">RAS</w:t>
             </w:r>
           </w:p>
         </w:tc>
@@ -10283,7 +10283,7 @@
                 <w:sz w:val="20"/>
                 <w:szCs w:val="20"/>
               </w:rPr>
-              <w:t xml:space="preserve">Lit</w:t>
+              <w:t xml:space="preserve">Matelas</w:t>
             </w:r>
           </w:p>
         </w:tc>
@@ -10498,7 +10498,7 @@
                 <w:sz w:val="20"/>
                 <w:szCs w:val="20"/>
               </w:rPr>
-              <w:t xml:space="preserve">Matelas</w:t>
+              <w:t xml:space="preserve">2 oreillers + couette</w:t>
             </w:r>
           </w:p>
         </w:tc>
@@ -10714,7 +10714,7 @@
                 <w:sz w:val="20"/>
                 <w:szCs w:val="20"/>
               </w:rPr>
-              <w:t xml:space="preserve">2 oreillers + couette</w:t>
+              <w:t xml:space="preserve">Parure de lit n°1 (1 drap + 1 housse de couette + 2 taies d’oreillers + 1 protège-matelas)</w:t>
             </w:r>
           </w:p>
         </w:tc>
@@ -10929,7 +10929,7 @@
                 <w:sz w:val="20"/>
                 <w:szCs w:val="20"/>
               </w:rPr>
-              <w:t xml:space="preserve">Parure de lit n°1 (1 drap + 1 housse de couette + 2 taies d’oreillers)</w:t>
+              <w:t xml:space="preserve">Parure de lit n°2 (1 drap + 1 housse de couette + 2 taies d’oreillers + 1 protège-matelas)</w:t>
             </w:r>
           </w:p>
         </w:tc>
@@ -11145,7 +11145,7 @@
                 <w:sz w:val="20"/>
                 <w:szCs w:val="20"/>
               </w:rPr>
-              <w:t xml:space="preserve">Parure de lit n°2 (1 drap + 1 housse de couette + 2 taies d’oreillers)</w:t>
+              <w:t xml:space="preserve">Bureau avec étagères</w:t>
             </w:r>
           </w:p>
         </w:tc>
@@ -11360,7 +11360,7 @@
                 <w:sz w:val="20"/>
                 <w:szCs w:val="20"/>
               </w:rPr>
-              <w:t xml:space="preserve">Bureau avec étagères</w:t>
+              <w:t xml:space="preserve">Chaise</w:t>
             </w:r>
           </w:p>
         </w:tc>
@@ -11576,7 +11576,7 @@
                 <w:sz w:val="20"/>
                 <w:szCs w:val="20"/>
               </w:rPr>
-              <w:t xml:space="preserve">Chaise</w:t>
+              <w:t xml:space="preserve">Coussin jaune sur chaise</w:t>
             </w:r>
           </w:p>
         </w:tc>
@@ -11791,7 +11791,7 @@
                 <w:sz w:val="20"/>
                 <w:szCs w:val="20"/>
               </w:rPr>
-              <w:t xml:space="preserve">Coussin jaune sur chaise</w:t>
+              <w:t xml:space="preserve">Armoire dressing</w:t>
             </w:r>
           </w:p>
         </w:tc>
@@ -12007,7 +12007,7 @@
                 <w:sz w:val="20"/>
                 <w:szCs w:val="20"/>
               </w:rPr>
-              <w:t xml:space="preserve">Armoire dressing</w:t>
+              <w:t xml:space="preserve">20 cintres noirs velours</w:t>
             </w:r>
           </w:p>
         </w:tc>
@@ -12193,7 +12193,7 @@
                 <w:sz w:val="20"/>
                 <w:szCs w:val="20"/>
               </w:rPr>
-              <w:t xml:space="preserve"/>
+              <w:t xml:space="preserve">Chambre 1 (côté salon)</w:t>
             </w:r>
           </w:p>
         </w:tc>
@@ -12222,7 +12222,7 @@
                 <w:sz w:val="20"/>
                 <w:szCs w:val="20"/>
               </w:rPr>
-              <w:t xml:space="preserve">20 cintres noirs velours</w:t>
+              <w:t xml:space="preserve">Porte</w:t>
             </w:r>
           </w:p>
         </w:tc>
@@ -12245,6 +12245,22 @@
             <w:vAlign w:val="center"/>
           </w:tcPr>
           <w:p>
+            <w:r>
+              <w:rPr>
+                <w:rFonts w:ascii="Times New Roman" w:cs="Times New Roman" w:eastAsia="Times New Roman" w:hAnsi="Times New Roman"/>
+                <w:sz w:val="20"/>
+                <w:szCs w:val="20"/>
+              </w:rPr>
+              <w:t xml:space="preserve">☐ Bon</w:t>
+            </w:r>
+            <w:r>
+              <w:rPr>
+                <w:rFonts w:ascii="Times New Roman" w:cs="Times New Roman" w:eastAsia="Times New Roman" w:hAnsi="Times New Roman"/>
+                <w:sz w:val="20"/>
+                <w:szCs w:val="20"/>
+              </w:rPr>
+              <w:t xml:space="preserve"> </w:t>
+            </w:r>
             <w:r>
               <w:rPr>
                 <w:rFonts w:ascii="Times New Roman" w:cs="Times New Roman" w:eastAsia="Times New Roman" w:hAnsi="Times New Roman"/>
@@ -12253,23 +12269,7 @@
                 <w:sz w:val="20"/>
                 <w:szCs w:val="20"/>
               </w:rPr>
-              <w:t xml:space="preserve">X Bon</w:t>
-            </w:r>
-            <w:r>
-              <w:rPr>
-                <w:rFonts w:ascii="Times New Roman" w:cs="Times New Roman" w:eastAsia="Times New Roman" w:hAnsi="Times New Roman"/>
-                <w:sz w:val="20"/>
-                <w:szCs w:val="20"/>
-              </w:rPr>
-              <w:t xml:space="preserve"> </w:t>
-            </w:r>
-            <w:r>
-              <w:rPr>
-                <w:rFonts w:ascii="Times New Roman" w:cs="Times New Roman" w:eastAsia="Times New Roman" w:hAnsi="Times New Roman"/>
-                <w:sz w:val="20"/>
-                <w:szCs w:val="20"/>
-              </w:rPr>
-              <w:t xml:space="preserve">☐ Usage</w:t>
+              <w:t xml:space="preserve">X Usage</w:t>
             </w:r>
             <w:r>
               <w:rPr>
@@ -12375,7 +12375,7 @@
                 <w:sz w:val="15"/>
                 <w:szCs w:val="15"/>
               </w:rPr>
-              <w:t xml:space="preserve">RAS</w:t>
+              <w:t xml:space="preserve">Légères craquelures de peinture</w:t>
             </w:r>
           </w:p>
         </w:tc>
@@ -12410,7 +12410,7 @@
                 <w:sz w:val="20"/>
                 <w:szCs w:val="20"/>
               </w:rPr>
-              <w:t xml:space="preserve">Chambre 1 (côté salon)</w:t>
+              <w:t xml:space="preserve"/>
             </w:r>
           </w:p>
         </w:tc>
@@ -12438,7 +12438,7 @@
                 <w:sz w:val="20"/>
                 <w:szCs w:val="20"/>
               </w:rPr>
-              <w:t xml:space="preserve">Porte</w:t>
+              <w:t xml:space="preserve">Murs</w:t>
             </w:r>
           </w:p>
         </w:tc>
@@ -12588,7 +12588,7 @@
                 <w:sz w:val="15"/>
                 <w:szCs w:val="15"/>
               </w:rPr>
-              <w:t xml:space="preserve">Légères craquelures de peinture</w:t>
+              <w:t xml:space="preserve">Décoloration grisâtre et traces diffuses sur un pan de mur</w:t>
             </w:r>
           </w:p>
         </w:tc>
@@ -12653,7 +12653,7 @@
                 <w:sz w:val="20"/>
                 <w:szCs w:val="20"/>
               </w:rPr>
-              <w:t xml:space="preserve">Murs</w:t>
+              <w:t xml:space="preserve">Plafond</w:t>
             </w:r>
           </w:p>
         </w:tc>
@@ -12806,7 +12806,7 @@
                 <w:sz w:val="15"/>
                 <w:szCs w:val="15"/>
               </w:rPr>
-              <w:t xml:space="preserve">Décoloration grisâtre et traces diffuses sur un pan de mur</w:t>
+              <w:t xml:space="preserve">Légères craquelures de peinture</w:t>
             </w:r>
           </w:p>
         </w:tc>
@@ -12869,7 +12869,7 @@
                 <w:sz w:val="20"/>
                 <w:szCs w:val="20"/>
               </w:rPr>
-              <w:t xml:space="preserve">Plafond</w:t>
+              <w:t xml:space="preserve">Sol (parquet)</w:t>
             </w:r>
           </w:p>
         </w:tc>
@@ -12891,22 +12891,6 @@
             <w:vAlign w:val="center"/>
           </w:tcPr>
           <w:p>
-            <w:r>
-              <w:rPr>
-                <w:rFonts w:ascii="Times New Roman" w:cs="Times New Roman" w:eastAsia="Times New Roman" w:hAnsi="Times New Roman"/>
-                <w:sz w:val="20"/>
-                <w:szCs w:val="20"/>
-              </w:rPr>
-              <w:t xml:space="preserve">☐ Bon</w:t>
-            </w:r>
-            <w:r>
-              <w:rPr>
-                <w:rFonts w:ascii="Times New Roman" w:cs="Times New Roman" w:eastAsia="Times New Roman" w:hAnsi="Times New Roman"/>
-                <w:sz w:val="20"/>
-                <w:szCs w:val="20"/>
-              </w:rPr>
-              <w:t xml:space="preserve"> </w:t>
-            </w:r>
             <w:r>
               <w:rPr>
                 <w:rFonts w:ascii="Times New Roman" w:cs="Times New Roman" w:eastAsia="Times New Roman" w:hAnsi="Times New Roman"/>
@@ -12915,7 +12899,23 @@
                 <w:sz w:val="20"/>
                 <w:szCs w:val="20"/>
               </w:rPr>
-              <w:t xml:space="preserve">X Usage</w:t>
+              <w:t xml:space="preserve">X Bon</w:t>
+            </w:r>
+            <w:r>
+              <w:rPr>
+                <w:rFonts w:ascii="Times New Roman" w:cs="Times New Roman" w:eastAsia="Times New Roman" w:hAnsi="Times New Roman"/>
+                <w:sz w:val="20"/>
+                <w:szCs w:val="20"/>
+              </w:rPr>
+              <w:t xml:space="preserve"> </w:t>
+            </w:r>
+            <w:r>
+              <w:rPr>
+                <w:rFonts w:ascii="Times New Roman" w:cs="Times New Roman" w:eastAsia="Times New Roman" w:hAnsi="Times New Roman"/>
+                <w:sz w:val="20"/>
+                <w:szCs w:val="20"/>
+              </w:rPr>
+              <w:t xml:space="preserve">☐ Usage</w:t>
             </w:r>
             <w:r>
               <w:rPr>
@@ -13019,7 +13019,7 @@
                 <w:sz w:val="15"/>
                 <w:szCs w:val="15"/>
               </w:rPr>
-              <w:t xml:space="preserve">Légères craquelures de peinture</w:t>
+              <w:t xml:space="preserve">RAS</w:t>
             </w:r>
           </w:p>
         </w:tc>
@@ -13084,7 +13084,7 @@
                 <w:sz w:val="20"/>
                 <w:szCs w:val="20"/>
               </w:rPr>
-              <w:t xml:space="preserve">Sol (parquet)</w:t>
+              <w:t xml:space="preserve">Volets</w:t>
             </w:r>
           </w:p>
         </w:tc>
@@ -13300,7 +13300,7 @@
                 <w:sz w:val="20"/>
                 <w:szCs w:val="20"/>
               </w:rPr>
-              <w:t xml:space="preserve">Volets</w:t>
+              <w:t xml:space="preserve">Rideaux occultants</w:t>
             </w:r>
           </w:p>
         </w:tc>
@@ -13322,6 +13322,22 @@
             <w:vAlign w:val="center"/>
           </w:tcPr>
           <w:p>
+            <w:r>
+              <w:rPr>
+                <w:rFonts w:ascii="Times New Roman" w:cs="Times New Roman" w:eastAsia="Times New Roman" w:hAnsi="Times New Roman"/>
+                <w:sz w:val="20"/>
+                <w:szCs w:val="20"/>
+              </w:rPr>
+              <w:t xml:space="preserve">☐ Bon</w:t>
+            </w:r>
+            <w:r>
+              <w:rPr>
+                <w:rFonts w:ascii="Times New Roman" w:cs="Times New Roman" w:eastAsia="Times New Roman" w:hAnsi="Times New Roman"/>
+                <w:sz w:val="20"/>
+                <w:szCs w:val="20"/>
+              </w:rPr>
+              <w:t xml:space="preserve"> </w:t>
+            </w:r>
             <w:r>
               <w:rPr>
                 <w:rFonts w:ascii="Times New Roman" w:cs="Times New Roman" w:eastAsia="Times New Roman" w:hAnsi="Times New Roman"/>
@@ -13330,23 +13346,7 @@
                 <w:sz w:val="20"/>
                 <w:szCs w:val="20"/>
               </w:rPr>
-              <w:t xml:space="preserve">X Bon</w:t>
-            </w:r>
-            <w:r>
-              <w:rPr>
-                <w:rFonts w:ascii="Times New Roman" w:cs="Times New Roman" w:eastAsia="Times New Roman" w:hAnsi="Times New Roman"/>
-                <w:sz w:val="20"/>
-                <w:szCs w:val="20"/>
-              </w:rPr>
-              <w:t xml:space="preserve"> </w:t>
-            </w:r>
-            <w:r>
-              <w:rPr>
-                <w:rFonts w:ascii="Times New Roman" w:cs="Times New Roman" w:eastAsia="Times New Roman" w:hAnsi="Times New Roman"/>
-                <w:sz w:val="20"/>
-                <w:szCs w:val="20"/>
-              </w:rPr>
-              <w:t xml:space="preserve">☐ Usage</w:t>
+              <w:t xml:space="preserve">X Usage</w:t>
             </w:r>
             <w:r>
               <w:rPr>
@@ -13515,7 +13515,7 @@
                 <w:sz w:val="20"/>
                 <w:szCs w:val="20"/>
               </w:rPr>
-              <w:t xml:space="preserve">Rideaux occultants</w:t>
+              <w:t xml:space="preserve">Lit</w:t>
             </w:r>
           </w:p>
         </w:tc>
@@ -13668,7 +13668,7 @@
                 <w:sz w:val="15"/>
                 <w:szCs w:val="15"/>
               </w:rPr>
-              <w:t xml:space="preserve">RAS</w:t>
+              <w:t xml:space="preserve">Petites taches sur les planches de la colonne du lit ; traces de liquide sur les lattes en bois ; une vis manquante</w:t>
             </w:r>
           </w:p>
         </w:tc>
@@ -13731,7 +13731,7 @@
                 <w:sz w:val="20"/>
                 <w:szCs w:val="20"/>
               </w:rPr>
-              <w:t xml:space="preserve">Lit</w:t>
+              <w:t xml:space="preserve">Tiroirs du lit x3</w:t>
             </w:r>
           </w:p>
         </w:tc>
@@ -13760,6 +13760,22 @@
                 <w:szCs w:val="20"/>
               </w:rPr>
               <w:t xml:space="preserve">☐ Bon</w:t>
+            </w:r>
+            <w:r>
+              <w:rPr>
+                <w:rFonts w:ascii="Times New Roman" w:cs="Times New Roman" w:eastAsia="Times New Roman" w:hAnsi="Times New Roman"/>
+                <w:sz w:val="20"/>
+                <w:szCs w:val="20"/>
+              </w:rPr>
+              <w:t xml:space="preserve"> </w:t>
+            </w:r>
+            <w:r>
+              <w:rPr>
+                <w:rFonts w:ascii="Times New Roman" w:cs="Times New Roman" w:eastAsia="Times New Roman" w:hAnsi="Times New Roman"/>
+                <w:sz w:val="20"/>
+                <w:szCs w:val="20"/>
+              </w:rPr>
+              <w:t xml:space="preserve">☐ Usage</w:t>
             </w:r>
             <w:r>
               <w:rPr>
@@ -13777,23 +13793,7 @@
                 <w:sz w:val="20"/>
                 <w:szCs w:val="20"/>
               </w:rPr>
-              <w:t xml:space="preserve">X Usage</w:t>
-            </w:r>
-            <w:r>
-              <w:rPr>
-                <w:rFonts w:ascii="Times New Roman" w:cs="Times New Roman" w:eastAsia="Times New Roman" w:hAnsi="Times New Roman"/>
-                <w:sz w:val="20"/>
-                <w:szCs w:val="20"/>
-              </w:rPr>
-              <w:t xml:space="preserve"> </w:t>
-            </w:r>
-            <w:r>
-              <w:rPr>
-                <w:rFonts w:ascii="Times New Roman" w:cs="Times New Roman" w:eastAsia="Times New Roman" w:hAnsi="Times New Roman"/>
-                <w:sz w:val="20"/>
-                <w:szCs w:val="20"/>
-              </w:rPr>
-              <w:t xml:space="preserve">☐ Mauvais</w:t>
+              <w:t xml:space="preserve">X Mauvais</w:t>
             </w:r>
           </w:p>
         </w:tc>
@@ -13881,7 +13881,7 @@
                 <w:sz w:val="15"/>
                 <w:szCs w:val="15"/>
               </w:rPr>
-              <w:t xml:space="preserve">Petites taches sur les planches de la colonne du lit ; traces de liquide sur les lattes en bois ; une vis manquante</w:t>
+              <w:t xml:space="preserve">Tiroir 1 : glissière métallique désolidarisée de son logement. Tiroir 2 : fixation/coulisse latérale endommagée. Tiroir 3 : bois détérioré par du liquide/humidité</w:t>
             </w:r>
           </w:p>
         </w:tc>
@@ -13946,7 +13946,7 @@
                 <w:sz w:val="20"/>
                 <w:szCs w:val="20"/>
               </w:rPr>
-              <w:t xml:space="preserve">Tiroirs du lit x3</w:t>
+              <w:t xml:space="preserve">Matelas</w:t>
             </w:r>
           </w:p>
         </w:tc>
@@ -13969,38 +13969,6 @@
             <w:vAlign w:val="center"/>
           </w:tcPr>
           <w:p>
-            <w:r>
-              <w:rPr>
-                <w:rFonts w:ascii="Times New Roman" w:cs="Times New Roman" w:eastAsia="Times New Roman" w:hAnsi="Times New Roman"/>
-                <w:sz w:val="20"/>
-                <w:szCs w:val="20"/>
-              </w:rPr>
-              <w:t xml:space="preserve">☐ Bon</w:t>
-            </w:r>
-            <w:r>
-              <w:rPr>
-                <w:rFonts w:ascii="Times New Roman" w:cs="Times New Roman" w:eastAsia="Times New Roman" w:hAnsi="Times New Roman"/>
-                <w:sz w:val="20"/>
-                <w:szCs w:val="20"/>
-              </w:rPr>
-              <w:t xml:space="preserve"> </w:t>
-            </w:r>
-            <w:r>
-              <w:rPr>
-                <w:rFonts w:ascii="Times New Roman" w:cs="Times New Roman" w:eastAsia="Times New Roman" w:hAnsi="Times New Roman"/>
-                <w:sz w:val="20"/>
-                <w:szCs w:val="20"/>
-              </w:rPr>
-              <w:t xml:space="preserve">☐ Usage</w:t>
-            </w:r>
-            <w:r>
-              <w:rPr>
-                <w:rFonts w:ascii="Times New Roman" w:cs="Times New Roman" w:eastAsia="Times New Roman" w:hAnsi="Times New Roman"/>
-                <w:sz w:val="20"/>
-                <w:szCs w:val="20"/>
-              </w:rPr>
-              <w:t xml:space="preserve"> </w:t>
-            </w:r>
             <w:r>
               <w:rPr>
                 <w:rFonts w:ascii="Times New Roman" w:cs="Times New Roman" w:eastAsia="Times New Roman" w:hAnsi="Times New Roman"/>
@@ -14009,7 +13977,39 @@
                 <w:sz w:val="20"/>
                 <w:szCs w:val="20"/>
               </w:rPr>
-              <w:t xml:space="preserve">X Mauvais</w:t>
+              <w:t xml:space="preserve">X Bon</w:t>
+            </w:r>
+            <w:r>
+              <w:rPr>
+                <w:rFonts w:ascii="Times New Roman" w:cs="Times New Roman" w:eastAsia="Times New Roman" w:hAnsi="Times New Roman"/>
+                <w:sz w:val="20"/>
+                <w:szCs w:val="20"/>
+              </w:rPr>
+              <w:t xml:space="preserve"> </w:t>
+            </w:r>
+            <w:r>
+              <w:rPr>
+                <w:rFonts w:ascii="Times New Roman" w:cs="Times New Roman" w:eastAsia="Times New Roman" w:hAnsi="Times New Roman"/>
+                <w:sz w:val="20"/>
+                <w:szCs w:val="20"/>
+              </w:rPr>
+              <w:t xml:space="preserve">☐ Usage</w:t>
+            </w:r>
+            <w:r>
+              <w:rPr>
+                <w:rFonts w:ascii="Times New Roman" w:cs="Times New Roman" w:eastAsia="Times New Roman" w:hAnsi="Times New Roman"/>
+                <w:sz w:val="20"/>
+                <w:szCs w:val="20"/>
+              </w:rPr>
+              <w:t xml:space="preserve"> </w:t>
+            </w:r>
+            <w:r>
+              <w:rPr>
+                <w:rFonts w:ascii="Times New Roman" w:cs="Times New Roman" w:eastAsia="Times New Roman" w:hAnsi="Times New Roman"/>
+                <w:sz w:val="20"/>
+                <w:szCs w:val="20"/>
+              </w:rPr>
+              <w:t xml:space="preserve">☐ Mauvais</w:t>
             </w:r>
           </w:p>
         </w:tc>
@@ -14099,7 +14099,7 @@
                 <w:sz w:val="15"/>
                 <w:szCs w:val="15"/>
               </w:rPr>
-              <w:t xml:space="preserve">Tiroir 1 : glissière métallique désolidarisée de son logement. Tiroir 2 : fixation/coulisse latérale endommagée. Tiroir 3 : bois détérioré par du liquide/humidité</w:t>
+              <w:t xml:space="preserve">RAS</w:t>
             </w:r>
           </w:p>
         </w:tc>
@@ -14162,7 +14162,7 @@
                 <w:sz w:val="20"/>
                 <w:szCs w:val="20"/>
               </w:rPr>
-              <w:t xml:space="preserve">Matelas</w:t>
+              <w:t xml:space="preserve">2 oreillers + couette</w:t>
             </w:r>
           </w:p>
         </w:tc>
@@ -14184,6 +14184,22 @@
             <w:vAlign w:val="center"/>
           </w:tcPr>
           <w:p>
+            <w:r>
+              <w:rPr>
+                <w:rFonts w:ascii="Times New Roman" w:cs="Times New Roman" w:eastAsia="Times New Roman" w:hAnsi="Times New Roman"/>
+                <w:sz w:val="20"/>
+                <w:szCs w:val="20"/>
+              </w:rPr>
+              <w:t xml:space="preserve">☐ Bon</w:t>
+            </w:r>
+            <w:r>
+              <w:rPr>
+                <w:rFonts w:ascii="Times New Roman" w:cs="Times New Roman" w:eastAsia="Times New Roman" w:hAnsi="Times New Roman"/>
+                <w:sz w:val="20"/>
+                <w:szCs w:val="20"/>
+              </w:rPr>
+              <w:t xml:space="preserve"> </w:t>
+            </w:r>
             <w:r>
               <w:rPr>
                 <w:rFonts w:ascii="Times New Roman" w:cs="Times New Roman" w:eastAsia="Times New Roman" w:hAnsi="Times New Roman"/>
@@ -14192,23 +14208,7 @@
                 <w:sz w:val="20"/>
                 <w:szCs w:val="20"/>
               </w:rPr>
-              <w:t xml:space="preserve">X Bon</w:t>
-            </w:r>
-            <w:r>
-              <w:rPr>
-                <w:rFonts w:ascii="Times New Roman" w:cs="Times New Roman" w:eastAsia="Times New Roman" w:hAnsi="Times New Roman"/>
-                <w:sz w:val="20"/>
-                <w:szCs w:val="20"/>
-              </w:rPr>
-              <w:t xml:space="preserve"> </w:t>
-            </w:r>
-            <w:r>
-              <w:rPr>
-                <w:rFonts w:ascii="Times New Roman" w:cs="Times New Roman" w:eastAsia="Times New Roman" w:hAnsi="Times New Roman"/>
-                <w:sz w:val="20"/>
-                <w:szCs w:val="20"/>
-              </w:rPr>
-              <w:t xml:space="preserve">☐ Usage</w:t>
+              <w:t xml:space="preserve">X Usage</w:t>
             </w:r>
             <w:r>
               <w:rPr>
@@ -14377,7 +14377,7 @@
                 <w:sz w:val="20"/>
                 <w:szCs w:val="20"/>
               </w:rPr>
-              <w:t xml:space="preserve">Protège-matelas</w:t>
+              <w:t xml:space="preserve">Parure de lit n°1 (1 drap + 1 housse de couette + 2 taies d’oreillers + 1 protège-matelas)</w:t>
             </w:r>
           </w:p>
         </w:tc>
@@ -14400,22 +14400,6 @@
             <w:vAlign w:val="center"/>
           </w:tcPr>
           <w:p>
-            <w:r>
-              <w:rPr>
-                <w:rFonts w:ascii="Times New Roman" w:cs="Times New Roman" w:eastAsia="Times New Roman" w:hAnsi="Times New Roman"/>
-                <w:sz w:val="20"/>
-                <w:szCs w:val="20"/>
-              </w:rPr>
-              <w:t xml:space="preserve">☐ Bon</w:t>
-            </w:r>
-            <w:r>
-              <w:rPr>
-                <w:rFonts w:ascii="Times New Roman" w:cs="Times New Roman" w:eastAsia="Times New Roman" w:hAnsi="Times New Roman"/>
-                <w:sz w:val="20"/>
-                <w:szCs w:val="20"/>
-              </w:rPr>
-              <w:t xml:space="preserve"> </w:t>
-            </w:r>
             <w:r>
               <w:rPr>
                 <w:rFonts w:ascii="Times New Roman" w:cs="Times New Roman" w:eastAsia="Times New Roman" w:hAnsi="Times New Roman"/>
@@ -14424,7 +14408,23 @@
                 <w:sz w:val="20"/>
                 <w:szCs w:val="20"/>
               </w:rPr>
-              <w:t xml:space="preserve">X Usage</w:t>
+              <w:t xml:space="preserve">X Bon</w:t>
+            </w:r>
+            <w:r>
+              <w:rPr>
+                <w:rFonts w:ascii="Times New Roman" w:cs="Times New Roman" w:eastAsia="Times New Roman" w:hAnsi="Times New Roman"/>
+                <w:sz w:val="20"/>
+                <w:szCs w:val="20"/>
+              </w:rPr>
+              <w:t xml:space="preserve"> </w:t>
+            </w:r>
+            <w:r>
+              <w:rPr>
+                <w:rFonts w:ascii="Times New Roman" w:cs="Times New Roman" w:eastAsia="Times New Roman" w:hAnsi="Times New Roman"/>
+                <w:sz w:val="20"/>
+                <w:szCs w:val="20"/>
+              </w:rPr>
+              <w:t xml:space="preserve">☐ Usage</w:t>
             </w:r>
             <w:r>
               <w:rPr>
@@ -14530,7 +14530,7 @@
                 <w:sz w:val="15"/>
                 <w:szCs w:val="15"/>
               </w:rPr>
-              <w:t xml:space="preserve">Auréole de taches jaunâtres</w:t>
+              <w:t xml:space="preserve">RAS</w:t>
             </w:r>
           </w:p>
         </w:tc>
@@ -14593,438 +14593,7 @@
                 <w:sz w:val="20"/>
                 <w:szCs w:val="20"/>
               </w:rPr>
-              <w:t xml:space="preserve">2 oreillers + couette</w:t>
-            </w:r>
-          </w:p>
-        </w:tc>
-        <w:tc>
-          <w:tcPr>
-            <w:tcW w:type="dxa" w:w="2940"/>
-            <w:tcBorders>
-              <w:top w:val="single" w:color="A6A6A6" w:sz="4"/>
-              <w:left w:val="single" w:color="A6A6A6" w:sz="4"/>
-              <w:bottom w:val="single" w:color="A6A6A6" w:sz="4"/>
-              <w:right w:val="single" w:color="A6A6A6" w:sz="4"/>
-            </w:tcBorders>
-            <w:tcMar>
-              <w:top w:type="dxa" w:w="30"/>
-              <w:left w:type="dxa" w:w="60"/>
-              <w:bottom w:type="dxa" w:w="30"/>
-              <w:right w:type="dxa" w:w="60"/>
-            </w:tcMar>
-            <w:vAlign w:val="center"/>
-          </w:tcPr>
-          <w:p>
-            <w:r>
-              <w:rPr>
-                <w:rFonts w:ascii="Times New Roman" w:cs="Times New Roman" w:eastAsia="Times New Roman" w:hAnsi="Times New Roman"/>
-                <w:sz w:val="20"/>
-                <w:szCs w:val="20"/>
-              </w:rPr>
-              <w:t xml:space="preserve">☐ Bon</w:t>
-            </w:r>
-            <w:r>
-              <w:rPr>
-                <w:rFonts w:ascii="Times New Roman" w:cs="Times New Roman" w:eastAsia="Times New Roman" w:hAnsi="Times New Roman"/>
-                <w:sz w:val="20"/>
-                <w:szCs w:val="20"/>
-              </w:rPr>
-              <w:t xml:space="preserve"> </w:t>
-            </w:r>
-            <w:r>
-              <w:rPr>
-                <w:rFonts w:ascii="Times New Roman" w:cs="Times New Roman" w:eastAsia="Times New Roman" w:hAnsi="Times New Roman"/>
-                <w:b/>
-                <w:bCs/>
-                <w:sz w:val="20"/>
-                <w:szCs w:val="20"/>
-              </w:rPr>
-              <w:t xml:space="preserve">X Usage</w:t>
-            </w:r>
-            <w:r>
-              <w:rPr>
-                <w:rFonts w:ascii="Times New Roman" w:cs="Times New Roman" w:eastAsia="Times New Roman" w:hAnsi="Times New Roman"/>
-                <w:sz w:val="20"/>
-                <w:szCs w:val="20"/>
-              </w:rPr>
-              <w:t xml:space="preserve"> </w:t>
-            </w:r>
-            <w:r>
-              <w:rPr>
-                <w:rFonts w:ascii="Times New Roman" w:cs="Times New Roman" w:eastAsia="Times New Roman" w:hAnsi="Times New Roman"/>
-                <w:sz w:val="20"/>
-                <w:szCs w:val="20"/>
-              </w:rPr>
-              <w:t xml:space="preserve">☐ Mauvais</w:t>
-            </w:r>
-          </w:p>
-        </w:tc>
-        <w:tc>
-          <w:tcPr>
-            <w:tcW w:type="dxa" w:w="2940"/>
-            <w:tcBorders>
-              <w:top w:val="single" w:color="A6A6A6" w:sz="4"/>
-              <w:left w:val="single" w:color="A6A6A6" w:sz="4"/>
-              <w:bottom w:val="single" w:color="A6A6A6" w:sz="4"/>
-              <w:right w:val="single" w:color="A6A6A6" w:sz="4"/>
-            </w:tcBorders>
-            <w:tcMar>
-              <w:top w:type="dxa" w:w="30"/>
-              <w:left w:type="dxa" w:w="60"/>
-              <w:bottom w:type="dxa" w:w="30"/>
-              <w:right w:type="dxa" w:w="60"/>
-            </w:tcMar>
-            <w:vAlign w:val="center"/>
-          </w:tcPr>
-          <w:p>
-            <w:r>
-              <w:rPr>
-                <w:rFonts w:ascii="Times New Roman" w:cs="Times New Roman" w:eastAsia="Times New Roman" w:hAnsi="Times New Roman"/>
-                <w:sz w:val="20"/>
-                <w:szCs w:val="20"/>
-              </w:rPr>
-              <w:t xml:space="preserve">☐ Bon</w:t>
-            </w:r>
-            <w:r>
-              <w:rPr>
-                <w:rFonts w:ascii="Times New Roman" w:cs="Times New Roman" w:eastAsia="Times New Roman" w:hAnsi="Times New Roman"/>
-                <w:sz w:val="20"/>
-                <w:szCs w:val="20"/>
-              </w:rPr>
-              <w:t xml:space="preserve"> </w:t>
-            </w:r>
-            <w:r>
-              <w:rPr>
-                <w:rFonts w:ascii="Times New Roman" w:cs="Times New Roman" w:eastAsia="Times New Roman" w:hAnsi="Times New Roman"/>
-                <w:sz w:val="20"/>
-                <w:szCs w:val="20"/>
-              </w:rPr>
-              <w:t xml:space="preserve">☐ Usage</w:t>
-            </w:r>
-            <w:r>
-              <w:rPr>
-                <w:rFonts w:ascii="Times New Roman" w:cs="Times New Roman" w:eastAsia="Times New Roman" w:hAnsi="Times New Roman"/>
-                <w:sz w:val="20"/>
-                <w:szCs w:val="20"/>
-              </w:rPr>
-              <w:t xml:space="preserve"> </w:t>
-            </w:r>
-            <w:r>
-              <w:rPr>
-                <w:rFonts w:ascii="Times New Roman" w:cs="Times New Roman" w:eastAsia="Times New Roman" w:hAnsi="Times New Roman"/>
-                <w:sz w:val="20"/>
-                <w:szCs w:val="20"/>
-              </w:rPr>
-              <w:t xml:space="preserve">☐ Mauvais</w:t>
-            </w:r>
-          </w:p>
-        </w:tc>
-        <w:tc>
-          <w:tcPr>
-            <w:tcW w:type="dxa" w:w="3360"/>
-            <w:tcBorders>
-              <w:top w:val="single" w:color="A6A6A6" w:sz="4"/>
-              <w:left w:val="single" w:color="A6A6A6" w:sz="4"/>
-              <w:bottom w:val="single" w:color="A6A6A6" w:sz="4"/>
-              <w:right w:val="single" w:color="A6A6A6" w:sz="4"/>
-            </w:tcBorders>
-            <w:tcMar>
-              <w:top w:type="dxa" w:w="30"/>
-              <w:left w:type="dxa" w:w="60"/>
-              <w:bottom w:type="dxa" w:w="30"/>
-              <w:right w:type="dxa" w:w="60"/>
-            </w:tcMar>
-            <w:vAlign w:val="center"/>
-          </w:tcPr>
-          <w:p>
-            <w:r>
-              <w:rPr>
-                <w:rFonts w:ascii="Arial" w:cs="Arial" w:eastAsia="Arial" w:hAnsi="Arial"/>
-                <w:sz w:val="15"/>
-                <w:szCs w:val="15"/>
-              </w:rPr>
-              <w:t xml:space="preserve">RAS</w:t>
-            </w:r>
-          </w:p>
-        </w:tc>
-      </w:tr>
-      <w:tr>
-        <w:trPr>
-          <w:cantSplit/>
-        </w:trPr>
-        <w:tc>
-          <w:tcPr>
-            <w:tcW w:type="dxa" w:w="1500"/>
-            <w:tcBorders>
-              <w:top w:val="single" w:color="A6A6A6" w:sz="4"/>
-              <w:left w:val="single" w:color="A6A6A6" w:sz="4"/>
-              <w:bottom w:val="single" w:color="A6A6A6" w:sz="4"/>
-              <w:right w:val="single" w:color="A6A6A6" w:sz="4"/>
-            </w:tcBorders>
-            <w:shd w:fill="F5F5F5" w:color="auto" w:val="clear"/>
-            <w:tcMar>
-              <w:top w:type="dxa" w:w="30"/>
-              <w:left w:type="dxa" w:w="60"/>
-              <w:bottom w:type="dxa" w:w="30"/>
-              <w:right w:type="dxa" w:w="60"/>
-            </w:tcMar>
-            <w:vAlign w:val="center"/>
-          </w:tcPr>
-          <w:p>
-            <w:r>
-              <w:rPr>
-                <w:rFonts w:ascii="Times New Roman" w:cs="Times New Roman" w:eastAsia="Times New Roman" w:hAnsi="Times New Roman"/>
-                <w:b/>
-                <w:bCs/>
-                <w:sz w:val="20"/>
-                <w:szCs w:val="20"/>
-              </w:rPr>
-              <w:t xml:space="preserve"/>
-            </w:r>
-          </w:p>
-        </w:tc>
-        <w:tc>
-          <w:tcPr>
-            <w:tcW w:type="dxa" w:w="2160"/>
-            <w:tcBorders>
-              <w:top w:val="single" w:color="A6A6A6" w:sz="4"/>
-              <w:left w:val="single" w:color="A6A6A6" w:sz="4"/>
-              <w:bottom w:val="single" w:color="A6A6A6" w:sz="4"/>
-              <w:right w:val="single" w:color="A6A6A6" w:sz="4"/>
-            </w:tcBorders>
-            <w:shd w:fill="F5F5F5" w:color="auto" w:val="clear"/>
-            <w:tcMar>
-              <w:top w:type="dxa" w:w="30"/>
-              <w:left w:type="dxa" w:w="60"/>
-              <w:bottom w:type="dxa" w:w="30"/>
-              <w:right w:type="dxa" w:w="60"/>
-            </w:tcMar>
-            <w:vAlign w:val="center"/>
-          </w:tcPr>
-          <w:p>
-            <w:r>
-              <w:rPr>
-                <w:rFonts w:ascii="Times New Roman" w:cs="Times New Roman" w:eastAsia="Times New Roman" w:hAnsi="Times New Roman"/>
-                <w:sz w:val="20"/>
-                <w:szCs w:val="20"/>
-              </w:rPr>
-              <w:t xml:space="preserve">Parure de lit n°1 (1 drap + 1 housse de couette + 2 taies d’oreillers)</w:t>
-            </w:r>
-          </w:p>
-        </w:tc>
-        <w:tc>
-          <w:tcPr>
-            <w:tcW w:type="dxa" w:w="2940"/>
-            <w:tcBorders>
-              <w:top w:val="single" w:color="A6A6A6" w:sz="4"/>
-              <w:left w:val="single" w:color="A6A6A6" w:sz="4"/>
-              <w:bottom w:val="single" w:color="A6A6A6" w:sz="4"/>
-              <w:right w:val="single" w:color="A6A6A6" w:sz="4"/>
-            </w:tcBorders>
-            <w:shd w:fill="F5F5F5" w:color="auto" w:val="clear"/>
-            <w:tcMar>
-              <w:top w:type="dxa" w:w="30"/>
-              <w:left w:type="dxa" w:w="60"/>
-              <w:bottom w:type="dxa" w:w="30"/>
-              <w:right w:type="dxa" w:w="60"/>
-            </w:tcMar>
-            <w:vAlign w:val="center"/>
-          </w:tcPr>
-          <w:p>
-            <w:r>
-              <w:rPr>
-                <w:rFonts w:ascii="Times New Roman" w:cs="Times New Roman" w:eastAsia="Times New Roman" w:hAnsi="Times New Roman"/>
-                <w:b/>
-                <w:bCs/>
-                <w:sz w:val="20"/>
-                <w:szCs w:val="20"/>
-              </w:rPr>
-              <w:t xml:space="preserve">X Bon</w:t>
-            </w:r>
-            <w:r>
-              <w:rPr>
-                <w:rFonts w:ascii="Times New Roman" w:cs="Times New Roman" w:eastAsia="Times New Roman" w:hAnsi="Times New Roman"/>
-                <w:sz w:val="20"/>
-                <w:szCs w:val="20"/>
-              </w:rPr>
-              <w:t xml:space="preserve"> </w:t>
-            </w:r>
-            <w:r>
-              <w:rPr>
-                <w:rFonts w:ascii="Times New Roman" w:cs="Times New Roman" w:eastAsia="Times New Roman" w:hAnsi="Times New Roman"/>
-                <w:sz w:val="20"/>
-                <w:szCs w:val="20"/>
-              </w:rPr>
-              <w:t xml:space="preserve">☐ Usage</w:t>
-            </w:r>
-            <w:r>
-              <w:rPr>
-                <w:rFonts w:ascii="Times New Roman" w:cs="Times New Roman" w:eastAsia="Times New Roman" w:hAnsi="Times New Roman"/>
-                <w:sz w:val="20"/>
-                <w:szCs w:val="20"/>
-              </w:rPr>
-              <w:t xml:space="preserve"> </w:t>
-            </w:r>
-            <w:r>
-              <w:rPr>
-                <w:rFonts w:ascii="Times New Roman" w:cs="Times New Roman" w:eastAsia="Times New Roman" w:hAnsi="Times New Roman"/>
-                <w:sz w:val="20"/>
-                <w:szCs w:val="20"/>
-              </w:rPr>
-              <w:t xml:space="preserve">☐ Mauvais</w:t>
-            </w:r>
-          </w:p>
-        </w:tc>
-        <w:tc>
-          <w:tcPr>
-            <w:tcW w:type="dxa" w:w="2940"/>
-            <w:tcBorders>
-              <w:top w:val="single" w:color="A6A6A6" w:sz="4"/>
-              <w:left w:val="single" w:color="A6A6A6" w:sz="4"/>
-              <w:bottom w:val="single" w:color="A6A6A6" w:sz="4"/>
-              <w:right w:val="single" w:color="A6A6A6" w:sz="4"/>
-            </w:tcBorders>
-            <w:shd w:fill="F5F5F5" w:color="auto" w:val="clear"/>
-            <w:tcMar>
-              <w:top w:type="dxa" w:w="30"/>
-              <w:left w:type="dxa" w:w="60"/>
-              <w:bottom w:type="dxa" w:w="30"/>
-              <w:right w:type="dxa" w:w="60"/>
-            </w:tcMar>
-            <w:vAlign w:val="center"/>
-          </w:tcPr>
-          <w:p>
-            <w:r>
-              <w:rPr>
-                <w:rFonts w:ascii="Times New Roman" w:cs="Times New Roman" w:eastAsia="Times New Roman" w:hAnsi="Times New Roman"/>
-                <w:sz w:val="20"/>
-                <w:szCs w:val="20"/>
-              </w:rPr>
-              <w:t xml:space="preserve">☐ Bon</w:t>
-            </w:r>
-            <w:r>
-              <w:rPr>
-                <w:rFonts w:ascii="Times New Roman" w:cs="Times New Roman" w:eastAsia="Times New Roman" w:hAnsi="Times New Roman"/>
-                <w:sz w:val="20"/>
-                <w:szCs w:val="20"/>
-              </w:rPr>
-              <w:t xml:space="preserve"> </w:t>
-            </w:r>
-            <w:r>
-              <w:rPr>
-                <w:rFonts w:ascii="Times New Roman" w:cs="Times New Roman" w:eastAsia="Times New Roman" w:hAnsi="Times New Roman"/>
-                <w:sz w:val="20"/>
-                <w:szCs w:val="20"/>
-              </w:rPr>
-              <w:t xml:space="preserve">☐ Usage</w:t>
-            </w:r>
-            <w:r>
-              <w:rPr>
-                <w:rFonts w:ascii="Times New Roman" w:cs="Times New Roman" w:eastAsia="Times New Roman" w:hAnsi="Times New Roman"/>
-                <w:sz w:val="20"/>
-                <w:szCs w:val="20"/>
-              </w:rPr>
-              <w:t xml:space="preserve"> </w:t>
-            </w:r>
-            <w:r>
-              <w:rPr>
-                <w:rFonts w:ascii="Times New Roman" w:cs="Times New Roman" w:eastAsia="Times New Roman" w:hAnsi="Times New Roman"/>
-                <w:sz w:val="20"/>
-                <w:szCs w:val="20"/>
-              </w:rPr>
-              <w:t xml:space="preserve">☐ Mauvais</w:t>
-            </w:r>
-          </w:p>
-        </w:tc>
-        <w:tc>
-          <w:tcPr>
-            <w:tcW w:type="dxa" w:w="3360"/>
-            <w:tcBorders>
-              <w:top w:val="single" w:color="A6A6A6" w:sz="4"/>
-              <w:left w:val="single" w:color="A6A6A6" w:sz="4"/>
-              <w:bottom w:val="single" w:color="A6A6A6" w:sz="4"/>
-              <w:right w:val="single" w:color="A6A6A6" w:sz="4"/>
-            </w:tcBorders>
-            <w:shd w:fill="F5F5F5" w:color="auto" w:val="clear"/>
-            <w:tcMar>
-              <w:top w:type="dxa" w:w="30"/>
-              <w:left w:type="dxa" w:w="60"/>
-              <w:bottom w:type="dxa" w:w="30"/>
-              <w:right w:type="dxa" w:w="60"/>
-            </w:tcMar>
-            <w:vAlign w:val="center"/>
-          </w:tcPr>
-          <w:p>
-            <w:r>
-              <w:rPr>
-                <w:rFonts w:ascii="Arial" w:cs="Arial" w:eastAsia="Arial" w:hAnsi="Arial"/>
-                <w:sz w:val="15"/>
-                <w:szCs w:val="15"/>
-              </w:rPr>
-              <w:t xml:space="preserve">RAS</w:t>
-            </w:r>
-          </w:p>
-        </w:tc>
-      </w:tr>
-      <w:tr>
-        <w:trPr>
-          <w:cantSplit/>
-        </w:trPr>
-        <w:tc>
-          <w:tcPr>
-            <w:tcW w:type="dxa" w:w="1500"/>
-            <w:tcBorders>
-              <w:top w:val="single" w:color="A6A6A6" w:sz="4"/>
-              <w:left w:val="single" w:color="A6A6A6" w:sz="4"/>
-              <w:bottom w:val="single" w:color="A6A6A6" w:sz="4"/>
-              <w:right w:val="single" w:color="A6A6A6" w:sz="4"/>
-            </w:tcBorders>
-            <w:tcMar>
-              <w:top w:type="dxa" w:w="30"/>
-              <w:left w:type="dxa" w:w="60"/>
-              <w:bottom w:type="dxa" w:w="30"/>
-              <w:right w:type="dxa" w:w="60"/>
-            </w:tcMar>
-            <w:vAlign w:val="center"/>
-          </w:tcPr>
-          <w:p>
-            <w:r>
-              <w:rPr>
-                <w:rFonts w:ascii="Times New Roman" w:cs="Times New Roman" w:eastAsia="Times New Roman" w:hAnsi="Times New Roman"/>
-                <w:b/>
-                <w:bCs/>
-                <w:sz w:val="20"/>
-                <w:szCs w:val="20"/>
-              </w:rPr>
-              <w:t xml:space="preserve"/>
-            </w:r>
-          </w:p>
-        </w:tc>
-        <w:tc>
-          <w:tcPr>
-            <w:tcW w:type="dxa" w:w="2160"/>
-            <w:tcBorders>
-              <w:top w:val="single" w:color="A6A6A6" w:sz="4"/>
-              <w:left w:val="single" w:color="A6A6A6" w:sz="4"/>
-              <w:bottom w:val="single" w:color="A6A6A6" w:sz="4"/>
-              <w:right w:val="single" w:color="A6A6A6" w:sz="4"/>
-            </w:tcBorders>
-            <w:tcMar>
-              <w:top w:type="dxa" w:w="30"/>
-              <w:left w:type="dxa" w:w="60"/>
-              <w:bottom w:type="dxa" w:w="30"/>
-              <w:right w:type="dxa" w:w="60"/>
-            </w:tcMar>
-            <w:vAlign w:val="center"/>
-          </w:tcPr>
-          <w:p>
-            <w:r>
-              <w:rPr>
-                <w:rFonts w:ascii="Times New Roman" w:cs="Times New Roman" w:eastAsia="Times New Roman" w:hAnsi="Times New Roman"/>
-                <w:sz w:val="20"/>
-                <w:szCs w:val="20"/>
-              </w:rPr>
-              <w:t xml:space="preserve">Parure de lit n°2 (1 drap + 1 housse de couette + 2 taies d’oreillers)</w:t>
+              <w:t xml:space="preserve">Parure de lit n°2 (1 drap + 1 housse de couette + 2 taies d’oreillers + 1 protège-matelas)</w:t>
             </w:r>
           </w:p>
         </w:tc>
@@ -16284,7 +15853,7 @@
                 <w:sz w:val="20"/>
                 <w:szCs w:val="20"/>
               </w:rPr>
-              <w:t xml:space="preserve">10 cintres en bois</w:t>
+              <w:t xml:space="preserve">7 cintres en bois</w:t>
             </w:r>
           </w:p>
         </w:tc>
@@ -18433,6 +18002,18 @@
             </w:r>
           </w:p>
           <w:p>
+            <w:r>
+              <w:rPr>
+                <w:rFonts w:ascii="Times New Roman" w:cs="Times New Roman" w:eastAsia="Times New Roman" w:hAnsi="Times New Roman"/>
+                <w:b/>
+                <w:bCs/>
+                <w:sz w:val="22"/>
+                <w:szCs w:val="22"/>
+              </w:rPr>
+              <w:t xml:space="preserve">Trousseau chambre 2 (côté sdb) :</w:t>
+            </w:r>
+          </w:p>
+          <w:p>
             <w:pPr>
               <w:pStyle w:val="ListParagraph"/>
               <w:numPr>
@@ -18501,7 +18082,7 @@
                 <w:sz w:val="22"/>
                 <w:szCs w:val="22"/>
               </w:rPr>
-              <w:t xml:space="preserve">Clé chambre 1 (côté salon) : 1</w:t>
+              <w:t xml:space="preserve">Clé boîte aux lettres : 1</w:t>
             </w:r>
           </w:p>
           <w:p>
@@ -18519,7 +18100,22 @@
                 <w:sz w:val="22"/>
                 <w:szCs w:val="22"/>
               </w:rPr>
-              <w:t xml:space="preserve">Clé boîte aux lettres : 1</w:t>
+              <w:t xml:space="preserve">Badge piétons résidence : 1</w:t>
+            </w:r>
+          </w:p>
+          <w:p>
+            <w:pPr>
+              <w:spacing w:before="120"/>
+            </w:pPr>
+            <w:r>
+              <w:rPr>
+                <w:rFonts w:ascii="Times New Roman" w:cs="Times New Roman" w:eastAsia="Times New Roman" w:hAnsi="Times New Roman"/>
+                <w:b/>
+                <w:bCs/>
+                <w:sz w:val="22"/>
+                <w:szCs w:val="22"/>
+              </w:rPr>
+              <w:t xml:space="preserve">Trousseau chambre 1 (côté salon) :</w:t>
             </w:r>
           </w:p>
           <w:p>
@@ -18537,7 +18133,7 @@
                 <w:sz w:val="22"/>
                 <w:szCs w:val="22"/>
               </w:rPr>
-              <w:t xml:space="preserve">Badge piétons résidence : 1</w:t>
+              <w:t xml:space="preserve">Clé bâtiment : 1</w:t>
             </w:r>
           </w:p>
           <w:p>
@@ -18552,12 +18148,97 @@
             <w:r>
               <w:rPr>
                 <w:rFonts w:ascii="Times New Roman" w:cs="Times New Roman" w:eastAsia="Times New Roman" w:hAnsi="Times New Roman"/>
+                <w:sz w:val="22"/>
+                <w:szCs w:val="22"/>
+              </w:rPr>
+              <w:t xml:space="preserve">Clé appartement : 1</w:t>
+            </w:r>
+          </w:p>
+          <w:p>
+            <w:pPr>
+              <w:pStyle w:val="ListParagraph"/>
+              <w:numPr>
+                <w:ilvl w:val="0"/>
+                <w:numId w:val="2"/>
+              </w:numPr>
+              <w:spacing w:after="80"/>
+            </w:pPr>
+            <w:r>
+              <w:rPr>
+                <w:rFonts w:ascii="Times New Roman" w:cs="Times New Roman" w:eastAsia="Times New Roman" w:hAnsi="Times New Roman"/>
+                <w:sz w:val="22"/>
+                <w:szCs w:val="22"/>
+              </w:rPr>
+              <w:t xml:space="preserve">Clé chambre 1 (côté salon) : 1</w:t>
+            </w:r>
+          </w:p>
+          <w:p>
+            <w:pPr>
+              <w:pStyle w:val="ListParagraph"/>
+              <w:numPr>
+                <w:ilvl w:val="0"/>
+                <w:numId w:val="2"/>
+              </w:numPr>
+              <w:spacing w:after="80"/>
+            </w:pPr>
+            <w:r>
+              <w:rPr>
+                <w:rFonts w:ascii="Times New Roman" w:cs="Times New Roman" w:eastAsia="Times New Roman" w:hAnsi="Times New Roman"/>
+                <w:sz w:val="22"/>
+                <w:szCs w:val="22"/>
+              </w:rPr>
+              <w:t xml:space="preserve">Clé boîte aux lettres : 1</w:t>
+            </w:r>
+          </w:p>
+          <w:p>
+            <w:pPr>
+              <w:pStyle w:val="ListParagraph"/>
+              <w:numPr>
+                <w:ilvl w:val="0"/>
+                <w:numId w:val="2"/>
+              </w:numPr>
+              <w:spacing w:after="80"/>
+            </w:pPr>
+            <w:r>
+              <w:rPr>
+                <w:rFonts w:ascii="Times New Roman" w:cs="Times New Roman" w:eastAsia="Times New Roman" w:hAnsi="Times New Roman"/>
+                <w:sz w:val="22"/>
+                <w:szCs w:val="22"/>
+              </w:rPr>
+              <w:t xml:space="preserve">Badge résidence : 1</w:t>
+            </w:r>
+          </w:p>
+          <w:p>
+            <w:pPr>
+              <w:pStyle w:val="ListParagraph"/>
+              <w:numPr>
+                <w:ilvl w:val="0"/>
+                <w:numId w:val="2"/>
+              </w:numPr>
+              <w:spacing w:after="80"/>
+            </w:pPr>
+            <w:r>
+              <w:rPr>
+                <w:rFonts w:ascii="Times New Roman" w:cs="Times New Roman" w:eastAsia="Times New Roman" w:hAnsi="Times New Roman"/>
+                <w:sz w:val="22"/>
+                <w:szCs w:val="22"/>
+              </w:rPr>
+              <w:t xml:space="preserve">Clé local à vélos : 1 (tordue/déformée)</w:t>
+            </w:r>
+          </w:p>
+          <w:p>
+            <w:pPr>
+              <w:spacing w:before="120"/>
+            </w:pPr>
+            <w:r>
+              <w:rPr>
+                <w:rFonts w:ascii="Times New Roman" w:cs="Times New Roman" w:eastAsia="Times New Roman" w:hAnsi="Times New Roman"/>
                 <w:b/>
                 <w:bCs/>
                 <w:sz w:val="22"/>
                 <w:szCs w:val="22"/>
               </w:rPr>
-              <w:t xml:space="preserve">Total : 5 clés + 1 badge</w:t>
+              <w:t xml:space="preserve">Total : 9 clés + 2 badges</w:t>
             </w:r>
           </w:p>
         </w:tc>

</xml_diff>

<commit_message>
Inventaire Esmat : en-tête, clés et observations générales ajustés
Co-Authored-By: Claude Opus 5.5 <noreply@anthropic.com>
Claude-Session: https://claude.ai/code/session_01RQKYxRKBDaebpwUM3RJinb
</commit_message>
<xml_diff>
--- a/inventaire/Inventaire_Etat_des_lieux_Esmat_ROSHANGAR_2026-09-01.docx
+++ b/inventaire/Inventaire_Etat_des_lieux_Esmat_ROSHANGAR_2026-09-01.docx
@@ -87,6 +87,26 @@
           <w:sz w:val="22"/>
           <w:szCs w:val="22"/>
         </w:rPr>
+        <w:t xml:space="preserve">Location : </w:t>
+      </w:r>
+      <w:r>
+        <w:rPr>
+          <w:rFonts w:ascii="Times New Roman" w:cs="Times New Roman" w:eastAsia="Times New Roman" w:hAnsi="Times New Roman"/>
+          <w:sz w:val="22"/>
+          <w:szCs w:val="22"/>
+        </w:rPr>
+        <w:t xml:space="preserve">Appartement en entier</w:t>
+      </w:r>
+    </w:p>
+    <w:p>
+      <w:r>
+        <w:rPr>
+          <w:rFonts w:ascii="Times New Roman" w:cs="Times New Roman" w:eastAsia="Times New Roman" w:hAnsi="Times New Roman"/>
+          <w:b/>
+          <w:bCs/>
+          <w:sz w:val="22"/>
+          <w:szCs w:val="22"/>
+        </w:rPr>
         <w:t xml:space="preserve">Chambres : </w:t>
       </w:r>
       <w:r>
@@ -115,7 +135,7 @@
           <w:sz w:val="22"/>
           <w:szCs w:val="22"/>
         </w:rPr>
-        <w:t xml:space="preserve">11 résidence les Ormes, 78700 Conflans-Sainte-Honorine</w:t>
+        <w:t xml:space="preserve">11 résidence les Ormes, 4e étage, porte de droite, 78700 Conflans-Sainte-Honorine</w:t>
       </w:r>
     </w:p>
     <w:p>
@@ -2740,7 +2760,7 @@
                 <w:sz w:val="20"/>
                 <w:szCs w:val="20"/>
               </w:rPr>
-              <w:t xml:space="preserve">Chromecast</w:t>
+              <w:t xml:space="preserve">Multi-prise</w:t>
             </w:r>
           </w:p>
         </w:tc>
@@ -2956,7 +2976,7 @@
                 <w:sz w:val="20"/>
                 <w:szCs w:val="20"/>
               </w:rPr>
-              <w:t xml:space="preserve">Multi-prise</w:t>
+              <w:t xml:space="preserve">Lampe allogène</w:t>
             </w:r>
           </w:p>
         </w:tc>
@@ -3171,7 +3191,7 @@
                 <w:sz w:val="20"/>
                 <w:szCs w:val="20"/>
               </w:rPr>
-              <w:t xml:space="preserve">Lampe allogène</w:t>
+              <w:t xml:space="preserve">Meuble blanc avec 3 casiers en osiers</w:t>
             </w:r>
           </w:p>
         </w:tc>
@@ -3194,6 +3214,22 @@
             <w:vAlign w:val="center"/>
           </w:tcPr>
           <w:p>
+            <w:r>
+              <w:rPr>
+                <w:rFonts w:ascii="Times New Roman" w:cs="Times New Roman" w:eastAsia="Times New Roman" w:hAnsi="Times New Roman"/>
+                <w:sz w:val="20"/>
+                <w:szCs w:val="20"/>
+              </w:rPr>
+              <w:t xml:space="preserve">☐ Bon</w:t>
+            </w:r>
+            <w:r>
+              <w:rPr>
+                <w:rFonts w:ascii="Times New Roman" w:cs="Times New Roman" w:eastAsia="Times New Roman" w:hAnsi="Times New Roman"/>
+                <w:sz w:val="20"/>
+                <w:szCs w:val="20"/>
+              </w:rPr>
+              <w:t xml:space="preserve"> </w:t>
+            </w:r>
             <w:r>
               <w:rPr>
                 <w:rFonts w:ascii="Times New Roman" w:cs="Times New Roman" w:eastAsia="Times New Roman" w:hAnsi="Times New Roman"/>
@@ -3202,23 +3238,7 @@
                 <w:sz w:val="20"/>
                 <w:szCs w:val="20"/>
               </w:rPr>
-              <w:t xml:space="preserve">X Bon</w:t>
-            </w:r>
-            <w:r>
-              <w:rPr>
-                <w:rFonts w:ascii="Times New Roman" w:cs="Times New Roman" w:eastAsia="Times New Roman" w:hAnsi="Times New Roman"/>
-                <w:sz w:val="20"/>
-                <w:szCs w:val="20"/>
-              </w:rPr>
-              <w:t xml:space="preserve"> </w:t>
-            </w:r>
-            <w:r>
-              <w:rPr>
-                <w:rFonts w:ascii="Times New Roman" w:cs="Times New Roman" w:eastAsia="Times New Roman" w:hAnsi="Times New Roman"/>
-                <w:sz w:val="20"/>
-                <w:szCs w:val="20"/>
-              </w:rPr>
-              <w:t xml:space="preserve">☐ Usage</w:t>
+              <w:t xml:space="preserve">X Usage</w:t>
             </w:r>
             <w:r>
               <w:rPr>
@@ -3324,7 +3344,7 @@
                 <w:sz w:val="15"/>
                 <w:szCs w:val="15"/>
               </w:rPr>
-              <w:t xml:space="preserve">RAS</w:t>
+              <w:t xml:space="preserve">Petites rayures côtés</w:t>
             </w:r>
           </w:p>
         </w:tc>
@@ -3359,7 +3379,7 @@
                 <w:sz w:val="20"/>
                 <w:szCs w:val="20"/>
               </w:rPr>
-              <w:t xml:space="preserve"/>
+              <w:t xml:space="preserve">Cuisine</w:t>
             </w:r>
           </w:p>
         </w:tc>
@@ -3387,7 +3407,7 @@
                 <w:sz w:val="20"/>
                 <w:szCs w:val="20"/>
               </w:rPr>
-              <w:t xml:space="preserve">Meuble blanc avec 3 casiers en osiers</w:t>
+              <w:t xml:space="preserve">Évier</w:t>
             </w:r>
           </w:p>
         </w:tc>
@@ -3409,22 +3429,6 @@
             <w:vAlign w:val="center"/>
           </w:tcPr>
           <w:p>
-            <w:r>
-              <w:rPr>
-                <w:rFonts w:ascii="Times New Roman" w:cs="Times New Roman" w:eastAsia="Times New Roman" w:hAnsi="Times New Roman"/>
-                <w:sz w:val="20"/>
-                <w:szCs w:val="20"/>
-              </w:rPr>
-              <w:t xml:space="preserve">☐ Bon</w:t>
-            </w:r>
-            <w:r>
-              <w:rPr>
-                <w:rFonts w:ascii="Times New Roman" w:cs="Times New Roman" w:eastAsia="Times New Roman" w:hAnsi="Times New Roman"/>
-                <w:sz w:val="20"/>
-                <w:szCs w:val="20"/>
-              </w:rPr>
-              <w:t xml:space="preserve"> </w:t>
-            </w:r>
             <w:r>
               <w:rPr>
                 <w:rFonts w:ascii="Times New Roman" w:cs="Times New Roman" w:eastAsia="Times New Roman" w:hAnsi="Times New Roman"/>
@@ -3433,7 +3437,23 @@
                 <w:sz w:val="20"/>
                 <w:szCs w:val="20"/>
               </w:rPr>
-              <w:t xml:space="preserve">X Usage</w:t>
+              <w:t xml:space="preserve">X Bon</w:t>
+            </w:r>
+            <w:r>
+              <w:rPr>
+                <w:rFonts w:ascii="Times New Roman" w:cs="Times New Roman" w:eastAsia="Times New Roman" w:hAnsi="Times New Roman"/>
+                <w:sz w:val="20"/>
+                <w:szCs w:val="20"/>
+              </w:rPr>
+              <w:t xml:space="preserve"> </w:t>
+            </w:r>
+            <w:r>
+              <w:rPr>
+                <w:rFonts w:ascii="Times New Roman" w:cs="Times New Roman" w:eastAsia="Times New Roman" w:hAnsi="Times New Roman"/>
+                <w:sz w:val="20"/>
+                <w:szCs w:val="20"/>
+              </w:rPr>
+              <w:t xml:space="preserve">☐ Usage</w:t>
             </w:r>
             <w:r>
               <w:rPr>
@@ -3537,7 +3557,7 @@
                 <w:sz w:val="15"/>
                 <w:szCs w:val="15"/>
               </w:rPr>
-              <w:t xml:space="preserve">Petites rayures côtés</w:t>
+              <w:t xml:space="preserve">Robinet changé en octobre 2025</w:t>
             </w:r>
           </w:p>
         </w:tc>
@@ -3573,7 +3593,7 @@
                 <w:sz w:val="20"/>
                 <w:szCs w:val="20"/>
               </w:rPr>
-              <w:t xml:space="preserve">Cuisine</w:t>
+              <w:t xml:space="preserve"/>
             </w:r>
           </w:p>
         </w:tc>
@@ -3602,7 +3622,7 @@
                 <w:sz w:val="20"/>
                 <w:szCs w:val="20"/>
               </w:rPr>
-              <w:t xml:space="preserve">Évier</w:t>
+              <w:t xml:space="preserve">Plaques induction</w:t>
             </w:r>
           </w:p>
         </w:tc>
@@ -3625,6 +3645,22 @@
             <w:vAlign w:val="center"/>
           </w:tcPr>
           <w:p>
+            <w:r>
+              <w:rPr>
+                <w:rFonts w:ascii="Times New Roman" w:cs="Times New Roman" w:eastAsia="Times New Roman" w:hAnsi="Times New Roman"/>
+                <w:sz w:val="20"/>
+                <w:szCs w:val="20"/>
+              </w:rPr>
+              <w:t xml:space="preserve">☐ Bon</w:t>
+            </w:r>
+            <w:r>
+              <w:rPr>
+                <w:rFonts w:ascii="Times New Roman" w:cs="Times New Roman" w:eastAsia="Times New Roman" w:hAnsi="Times New Roman"/>
+                <w:sz w:val="20"/>
+                <w:szCs w:val="20"/>
+              </w:rPr>
+              <w:t xml:space="preserve"> </w:t>
+            </w:r>
             <w:r>
               <w:rPr>
                 <w:rFonts w:ascii="Times New Roman" w:cs="Times New Roman" w:eastAsia="Times New Roman" w:hAnsi="Times New Roman"/>
@@ -3633,23 +3669,7 @@
                 <w:sz w:val="20"/>
                 <w:szCs w:val="20"/>
               </w:rPr>
-              <w:t xml:space="preserve">X Bon</w:t>
-            </w:r>
-            <w:r>
-              <w:rPr>
-                <w:rFonts w:ascii="Times New Roman" w:cs="Times New Roman" w:eastAsia="Times New Roman" w:hAnsi="Times New Roman"/>
-                <w:sz w:val="20"/>
-                <w:szCs w:val="20"/>
-              </w:rPr>
-              <w:t xml:space="preserve"> </w:t>
-            </w:r>
-            <w:r>
-              <w:rPr>
-                <w:rFonts w:ascii="Times New Roman" w:cs="Times New Roman" w:eastAsia="Times New Roman" w:hAnsi="Times New Roman"/>
-                <w:sz w:val="20"/>
-                <w:szCs w:val="20"/>
-              </w:rPr>
-              <w:t xml:space="preserve">☐ Usage</w:t>
+              <w:t xml:space="preserve">X Usage</w:t>
             </w:r>
             <w:r>
               <w:rPr>
@@ -3755,7 +3775,7 @@
                 <w:sz w:val="15"/>
                 <w:szCs w:val="15"/>
               </w:rPr>
-              <w:t xml:space="preserve">Robinet neuf, changé octobre 2025</w:t>
+              <w:t xml:space="preserve">Traces incrustées sur les deux plaques</w:t>
             </w:r>
           </w:p>
         </w:tc>
@@ -3818,7 +3838,7 @@
                 <w:sz w:val="20"/>
                 <w:szCs w:val="20"/>
               </w:rPr>
-              <w:t xml:space="preserve">Plaques induction</w:t>
+              <w:t xml:space="preserve">Four avec 1 grille + 1 plaque avec plats à four</w:t>
             </w:r>
           </w:p>
         </w:tc>
@@ -3840,22 +3860,6 @@
             <w:vAlign w:val="center"/>
           </w:tcPr>
           <w:p>
-            <w:r>
-              <w:rPr>
-                <w:rFonts w:ascii="Times New Roman" w:cs="Times New Roman" w:eastAsia="Times New Roman" w:hAnsi="Times New Roman"/>
-                <w:sz w:val="20"/>
-                <w:szCs w:val="20"/>
-              </w:rPr>
-              <w:t xml:space="preserve">☐ Bon</w:t>
-            </w:r>
-            <w:r>
-              <w:rPr>
-                <w:rFonts w:ascii="Times New Roman" w:cs="Times New Roman" w:eastAsia="Times New Roman" w:hAnsi="Times New Roman"/>
-                <w:sz w:val="20"/>
-                <w:szCs w:val="20"/>
-              </w:rPr>
-              <w:t xml:space="preserve"> </w:t>
-            </w:r>
             <w:r>
               <w:rPr>
                 <w:rFonts w:ascii="Times New Roman" w:cs="Times New Roman" w:eastAsia="Times New Roman" w:hAnsi="Times New Roman"/>
@@ -3864,7 +3868,23 @@
                 <w:sz w:val="20"/>
                 <w:szCs w:val="20"/>
               </w:rPr>
-              <w:t xml:space="preserve">X Usage</w:t>
+              <w:t xml:space="preserve">X Bon</w:t>
+            </w:r>
+            <w:r>
+              <w:rPr>
+                <w:rFonts w:ascii="Times New Roman" w:cs="Times New Roman" w:eastAsia="Times New Roman" w:hAnsi="Times New Roman"/>
+                <w:sz w:val="20"/>
+                <w:szCs w:val="20"/>
+              </w:rPr>
+              <w:t xml:space="preserve"> </w:t>
+            </w:r>
+            <w:r>
+              <w:rPr>
+                <w:rFonts w:ascii="Times New Roman" w:cs="Times New Roman" w:eastAsia="Times New Roman" w:hAnsi="Times New Roman"/>
+                <w:sz w:val="20"/>
+                <w:szCs w:val="20"/>
+              </w:rPr>
+              <w:t xml:space="preserve">☐ Usage</w:t>
             </w:r>
             <w:r>
               <w:rPr>
@@ -3968,7 +3988,7 @@
                 <w:sz w:val="15"/>
                 <w:szCs w:val="15"/>
               </w:rPr>
-              <w:t xml:space="preserve">Traces incrustées sur les deux plaques</w:t>
+              <w:t xml:space="preserve">RAS</w:t>
             </w:r>
           </w:p>
         </w:tc>
@@ -4033,7 +4053,7 @@
                 <w:sz w:val="20"/>
                 <w:szCs w:val="20"/>
               </w:rPr>
-              <w:t xml:space="preserve">Four avec 1 grille + 1 plaque avec plats à four</w:t>
+              <w:t xml:space="preserve">Hotte</w:t>
             </w:r>
           </w:p>
         </w:tc>
@@ -4249,7 +4269,7 @@
                 <w:sz w:val="20"/>
                 <w:szCs w:val="20"/>
               </w:rPr>
-              <w:t xml:space="preserve">Hotte</w:t>
+              <w:t xml:space="preserve">Réfrigérateur</w:t>
             </w:r>
           </w:p>
         </w:tc>
@@ -4271,6 +4291,22 @@
             <w:vAlign w:val="center"/>
           </w:tcPr>
           <w:p>
+            <w:r>
+              <w:rPr>
+                <w:rFonts w:ascii="Times New Roman" w:cs="Times New Roman" w:eastAsia="Times New Roman" w:hAnsi="Times New Roman"/>
+                <w:sz w:val="20"/>
+                <w:szCs w:val="20"/>
+              </w:rPr>
+              <w:t xml:space="preserve">☐ Bon</w:t>
+            </w:r>
+            <w:r>
+              <w:rPr>
+                <w:rFonts w:ascii="Times New Roman" w:cs="Times New Roman" w:eastAsia="Times New Roman" w:hAnsi="Times New Roman"/>
+                <w:sz w:val="20"/>
+                <w:szCs w:val="20"/>
+              </w:rPr>
+              <w:t xml:space="preserve"> </w:t>
+            </w:r>
             <w:r>
               <w:rPr>
                 <w:rFonts w:ascii="Times New Roman" w:cs="Times New Roman" w:eastAsia="Times New Roman" w:hAnsi="Times New Roman"/>
@@ -4279,23 +4315,7 @@
                 <w:sz w:val="20"/>
                 <w:szCs w:val="20"/>
               </w:rPr>
-              <w:t xml:space="preserve">X Bon</w:t>
-            </w:r>
-            <w:r>
-              <w:rPr>
-                <w:rFonts w:ascii="Times New Roman" w:cs="Times New Roman" w:eastAsia="Times New Roman" w:hAnsi="Times New Roman"/>
-                <w:sz w:val="20"/>
-                <w:szCs w:val="20"/>
-              </w:rPr>
-              <w:t xml:space="preserve"> </w:t>
-            </w:r>
-            <w:r>
-              <w:rPr>
-                <w:rFonts w:ascii="Times New Roman" w:cs="Times New Roman" w:eastAsia="Times New Roman" w:hAnsi="Times New Roman"/>
-                <w:sz w:val="20"/>
-                <w:szCs w:val="20"/>
-              </w:rPr>
-              <w:t xml:space="preserve">☐ Usage</w:t>
+              <w:t xml:space="preserve">X Usage</w:t>
             </w:r>
             <w:r>
               <w:rPr>
@@ -4464,7 +4484,7 @@
                 <w:sz w:val="20"/>
                 <w:szCs w:val="20"/>
               </w:rPr>
-              <w:t xml:space="preserve">Réfrigérateur</w:t>
+              <w:t xml:space="preserve">Placards</w:t>
             </w:r>
           </w:p>
         </w:tc>
@@ -4617,7 +4637,7 @@
                 <w:sz w:val="15"/>
                 <w:szCs w:val="15"/>
               </w:rPr>
-              <w:t xml:space="preserve">RAS</w:t>
+              <w:t xml:space="preserve">Bout en haut à droite recollé</w:t>
             </w:r>
           </w:p>
         </w:tc>
@@ -4680,7 +4700,7 @@
                 <w:sz w:val="20"/>
                 <w:szCs w:val="20"/>
               </w:rPr>
-              <w:t xml:space="preserve">Placards</w:t>
+              <w:t xml:space="preserve">Bouilloire</w:t>
             </w:r>
           </w:p>
         </w:tc>
@@ -4702,22 +4722,6 @@
             <w:vAlign w:val="center"/>
           </w:tcPr>
           <w:p>
-            <w:r>
-              <w:rPr>
-                <w:rFonts w:ascii="Times New Roman" w:cs="Times New Roman" w:eastAsia="Times New Roman" w:hAnsi="Times New Roman"/>
-                <w:sz w:val="20"/>
-                <w:szCs w:val="20"/>
-              </w:rPr>
-              <w:t xml:space="preserve">☐ Bon</w:t>
-            </w:r>
-            <w:r>
-              <w:rPr>
-                <w:rFonts w:ascii="Times New Roman" w:cs="Times New Roman" w:eastAsia="Times New Roman" w:hAnsi="Times New Roman"/>
-                <w:sz w:val="20"/>
-                <w:szCs w:val="20"/>
-              </w:rPr>
-              <w:t xml:space="preserve"> </w:t>
-            </w:r>
             <w:r>
               <w:rPr>
                 <w:rFonts w:ascii="Times New Roman" w:cs="Times New Roman" w:eastAsia="Times New Roman" w:hAnsi="Times New Roman"/>
@@ -4726,7 +4730,23 @@
                 <w:sz w:val="20"/>
                 <w:szCs w:val="20"/>
               </w:rPr>
-              <w:t xml:space="preserve">X Usage</w:t>
+              <w:t xml:space="preserve">X Bon</w:t>
+            </w:r>
+            <w:r>
+              <w:rPr>
+                <w:rFonts w:ascii="Times New Roman" w:cs="Times New Roman" w:eastAsia="Times New Roman" w:hAnsi="Times New Roman"/>
+                <w:sz w:val="20"/>
+                <w:szCs w:val="20"/>
+              </w:rPr>
+              <w:t xml:space="preserve"> </w:t>
+            </w:r>
+            <w:r>
+              <w:rPr>
+                <w:rFonts w:ascii="Times New Roman" w:cs="Times New Roman" w:eastAsia="Times New Roman" w:hAnsi="Times New Roman"/>
+                <w:sz w:val="20"/>
+                <w:szCs w:val="20"/>
+              </w:rPr>
+              <w:t xml:space="preserve">☐ Usage</w:t>
             </w:r>
             <w:r>
               <w:rPr>
@@ -4830,7 +4850,7 @@
                 <w:sz w:val="15"/>
                 <w:szCs w:val="15"/>
               </w:rPr>
-              <w:t xml:space="preserve">Bout en haut à droite recollé</w:t>
+              <w:t xml:space="preserve">RAS</w:t>
             </w:r>
           </w:p>
         </w:tc>
@@ -4895,7 +4915,7 @@
                 <w:sz w:val="20"/>
                 <w:szCs w:val="20"/>
               </w:rPr>
-              <w:t xml:space="preserve">Bouilloire</w:t>
+              <w:t xml:space="preserve">Grille-pain</w:t>
             </w:r>
           </w:p>
         </w:tc>
@@ -4918,6 +4938,22 @@
             <w:vAlign w:val="center"/>
           </w:tcPr>
           <w:p>
+            <w:r>
+              <w:rPr>
+                <w:rFonts w:ascii="Times New Roman" w:cs="Times New Roman" w:eastAsia="Times New Roman" w:hAnsi="Times New Roman"/>
+                <w:sz w:val="20"/>
+                <w:szCs w:val="20"/>
+              </w:rPr>
+              <w:t xml:space="preserve">☐ Bon</w:t>
+            </w:r>
+            <w:r>
+              <w:rPr>
+                <w:rFonts w:ascii="Times New Roman" w:cs="Times New Roman" w:eastAsia="Times New Roman" w:hAnsi="Times New Roman"/>
+                <w:sz w:val="20"/>
+                <w:szCs w:val="20"/>
+              </w:rPr>
+              <w:t xml:space="preserve"> </w:t>
+            </w:r>
             <w:r>
               <w:rPr>
                 <w:rFonts w:ascii="Times New Roman" w:cs="Times New Roman" w:eastAsia="Times New Roman" w:hAnsi="Times New Roman"/>
@@ -4926,23 +4962,7 @@
                 <w:sz w:val="20"/>
                 <w:szCs w:val="20"/>
               </w:rPr>
-              <w:t xml:space="preserve">X Bon</w:t>
-            </w:r>
-            <w:r>
-              <w:rPr>
-                <w:rFonts w:ascii="Times New Roman" w:cs="Times New Roman" w:eastAsia="Times New Roman" w:hAnsi="Times New Roman"/>
-                <w:sz w:val="20"/>
-                <w:szCs w:val="20"/>
-              </w:rPr>
-              <w:t xml:space="preserve"> </w:t>
-            </w:r>
-            <w:r>
-              <w:rPr>
-                <w:rFonts w:ascii="Times New Roman" w:cs="Times New Roman" w:eastAsia="Times New Roman" w:hAnsi="Times New Roman"/>
-                <w:sz w:val="20"/>
-                <w:szCs w:val="20"/>
-              </w:rPr>
-              <w:t xml:space="preserve">☐ Usage</w:t>
+              <w:t xml:space="preserve">X Usage</w:t>
             </w:r>
             <w:r>
               <w:rPr>
@@ -5048,7 +5068,7 @@
                 <w:sz w:val="15"/>
                 <w:szCs w:val="15"/>
               </w:rPr>
-              <w:t xml:space="preserve">Neuve</w:t>
+              <w:t xml:space="preserve"/>
             </w:r>
           </w:p>
         </w:tc>
@@ -5111,7 +5131,7 @@
                 <w:sz w:val="20"/>
                 <w:szCs w:val="20"/>
               </w:rPr>
-              <w:t xml:space="preserve">Grille-pain</w:t>
+              <w:t xml:space="preserve">Micro-ondes</w:t>
             </w:r>
           </w:p>
         </w:tc>
@@ -5261,7 +5281,7 @@
                 <w:sz w:val="15"/>
                 <w:szCs w:val="15"/>
               </w:rPr>
-              <w:t xml:space="preserve"/>
+              <w:t xml:space="preserve">Écaille sur un côté</w:t>
             </w:r>
           </w:p>
         </w:tc>
@@ -5326,7 +5346,7 @@
                 <w:sz w:val="20"/>
                 <w:szCs w:val="20"/>
               </w:rPr>
-              <w:t xml:space="preserve">Micro-ondes</w:t>
+              <w:t xml:space="preserve">Assiette x1 (rose)</w:t>
             </w:r>
           </w:p>
         </w:tc>
@@ -5349,22 +5369,6 @@
             <w:vAlign w:val="center"/>
           </w:tcPr>
           <w:p>
-            <w:r>
-              <w:rPr>
-                <w:rFonts w:ascii="Times New Roman" w:cs="Times New Roman" w:eastAsia="Times New Roman" w:hAnsi="Times New Roman"/>
-                <w:sz w:val="20"/>
-                <w:szCs w:val="20"/>
-              </w:rPr>
-              <w:t xml:space="preserve">☐ Bon</w:t>
-            </w:r>
-            <w:r>
-              <w:rPr>
-                <w:rFonts w:ascii="Times New Roman" w:cs="Times New Roman" w:eastAsia="Times New Roman" w:hAnsi="Times New Roman"/>
-                <w:sz w:val="20"/>
-                <w:szCs w:val="20"/>
-              </w:rPr>
-              <w:t xml:space="preserve"> </w:t>
-            </w:r>
             <w:r>
               <w:rPr>
                 <w:rFonts w:ascii="Times New Roman" w:cs="Times New Roman" w:eastAsia="Times New Roman" w:hAnsi="Times New Roman"/>
@@ -5373,7 +5377,23 @@
                 <w:sz w:val="20"/>
                 <w:szCs w:val="20"/>
               </w:rPr>
-              <w:t xml:space="preserve">X Usage</w:t>
+              <w:t xml:space="preserve">X Bon</w:t>
+            </w:r>
+            <w:r>
+              <w:rPr>
+                <w:rFonts w:ascii="Times New Roman" w:cs="Times New Roman" w:eastAsia="Times New Roman" w:hAnsi="Times New Roman"/>
+                <w:sz w:val="20"/>
+                <w:szCs w:val="20"/>
+              </w:rPr>
+              <w:t xml:space="preserve"> </w:t>
+            </w:r>
+            <w:r>
+              <w:rPr>
+                <w:rFonts w:ascii="Times New Roman" w:cs="Times New Roman" w:eastAsia="Times New Roman" w:hAnsi="Times New Roman"/>
+                <w:sz w:val="20"/>
+                <w:szCs w:val="20"/>
+              </w:rPr>
+              <w:t xml:space="preserve">☐ Usage</w:t>
             </w:r>
             <w:r>
               <w:rPr>
@@ -5479,7 +5499,7 @@
                 <w:sz w:val="15"/>
                 <w:szCs w:val="15"/>
               </w:rPr>
-              <w:t xml:space="preserve">Écaille sur un côté</w:t>
+              <w:t xml:space="preserve">RAS</w:t>
             </w:r>
           </w:p>
         </w:tc>
@@ -5542,7 +5562,7 @@
                 <w:sz w:val="20"/>
                 <w:szCs w:val="20"/>
               </w:rPr>
-              <w:t xml:space="preserve">Assiette x1 (rose)</w:t>
+              <w:t xml:space="preserve">Verres x2</w:t>
             </w:r>
           </w:p>
         </w:tc>
@@ -5757,7 +5777,7 @@
                 <w:sz w:val="20"/>
                 <w:szCs w:val="20"/>
               </w:rPr>
-              <w:t xml:space="preserve">Verres x2</w:t>
+              <w:t xml:space="preserve">Couverts : 2 fourchettes, 1 cuillère à soupe, 2 couteaux, 2 cuillères à café</w:t>
             </w:r>
           </w:p>
         </w:tc>
@@ -5973,7 +5993,7 @@
                 <w:sz w:val="20"/>
                 <w:szCs w:val="20"/>
               </w:rPr>
-              <w:t xml:space="preserve">Couverts : 2 fourchettes, 1 cuillère à soupe, 2 couteaux, 2 cuillères à café</w:t>
+              <w:t xml:space="preserve">Casseroles x2</w:t>
             </w:r>
           </w:p>
         </w:tc>
@@ -5995,6 +6015,22 @@
             <w:vAlign w:val="center"/>
           </w:tcPr>
           <w:p>
+            <w:r>
+              <w:rPr>
+                <w:rFonts w:ascii="Times New Roman" w:cs="Times New Roman" w:eastAsia="Times New Roman" w:hAnsi="Times New Roman"/>
+                <w:sz w:val="20"/>
+                <w:szCs w:val="20"/>
+              </w:rPr>
+              <w:t xml:space="preserve">☐ Bon</w:t>
+            </w:r>
+            <w:r>
+              <w:rPr>
+                <w:rFonts w:ascii="Times New Roman" w:cs="Times New Roman" w:eastAsia="Times New Roman" w:hAnsi="Times New Roman"/>
+                <w:sz w:val="20"/>
+                <w:szCs w:val="20"/>
+              </w:rPr>
+              <w:t xml:space="preserve"> </w:t>
+            </w:r>
             <w:r>
               <w:rPr>
                 <w:rFonts w:ascii="Times New Roman" w:cs="Times New Roman" w:eastAsia="Times New Roman" w:hAnsi="Times New Roman"/>
@@ -6003,23 +6039,7 @@
                 <w:sz w:val="20"/>
                 <w:szCs w:val="20"/>
               </w:rPr>
-              <w:t xml:space="preserve">X Bon</w:t>
-            </w:r>
-            <w:r>
-              <w:rPr>
-                <w:rFonts w:ascii="Times New Roman" w:cs="Times New Roman" w:eastAsia="Times New Roman" w:hAnsi="Times New Roman"/>
-                <w:sz w:val="20"/>
-                <w:szCs w:val="20"/>
-              </w:rPr>
-              <w:t xml:space="preserve"> </w:t>
-            </w:r>
-            <w:r>
-              <w:rPr>
-                <w:rFonts w:ascii="Times New Roman" w:cs="Times New Roman" w:eastAsia="Times New Roman" w:hAnsi="Times New Roman"/>
-                <w:sz w:val="20"/>
-                <w:szCs w:val="20"/>
-              </w:rPr>
-              <w:t xml:space="preserve">☐ Usage</w:t>
+              <w:t xml:space="preserve">X Usage</w:t>
             </w:r>
             <w:r>
               <w:rPr>
@@ -6188,7 +6208,7 @@
                 <w:sz w:val="20"/>
                 <w:szCs w:val="20"/>
               </w:rPr>
-              <w:t xml:space="preserve">Casseroles x2</w:t>
+              <w:t xml:space="preserve">Poêles x2</w:t>
             </w:r>
           </w:p>
         </w:tc>
@@ -6404,7 +6424,7 @@
                 <w:sz w:val="20"/>
                 <w:szCs w:val="20"/>
               </w:rPr>
-              <w:t xml:space="preserve">Poêles x2</w:t>
+              <w:t xml:space="preserve">Multi-prise</w:t>
             </w:r>
           </w:p>
         </w:tc>
@@ -6426,22 +6446,6 @@
             <w:vAlign w:val="center"/>
           </w:tcPr>
           <w:p>
-            <w:r>
-              <w:rPr>
-                <w:rFonts w:ascii="Times New Roman" w:cs="Times New Roman" w:eastAsia="Times New Roman" w:hAnsi="Times New Roman"/>
-                <w:sz w:val="20"/>
-                <w:szCs w:val="20"/>
-              </w:rPr>
-              <w:t xml:space="preserve">☐ Bon</w:t>
-            </w:r>
-            <w:r>
-              <w:rPr>
-                <w:rFonts w:ascii="Times New Roman" w:cs="Times New Roman" w:eastAsia="Times New Roman" w:hAnsi="Times New Roman"/>
-                <w:sz w:val="20"/>
-                <w:szCs w:val="20"/>
-              </w:rPr>
-              <w:t xml:space="preserve"> </w:t>
-            </w:r>
             <w:r>
               <w:rPr>
                 <w:rFonts w:ascii="Times New Roman" w:cs="Times New Roman" w:eastAsia="Times New Roman" w:hAnsi="Times New Roman"/>
@@ -6450,7 +6454,23 @@
                 <w:sz w:val="20"/>
                 <w:szCs w:val="20"/>
               </w:rPr>
-              <w:t xml:space="preserve">X Usage</w:t>
+              <w:t xml:space="preserve">X Bon</w:t>
+            </w:r>
+            <w:r>
+              <w:rPr>
+                <w:rFonts w:ascii="Times New Roman" w:cs="Times New Roman" w:eastAsia="Times New Roman" w:hAnsi="Times New Roman"/>
+                <w:sz w:val="20"/>
+                <w:szCs w:val="20"/>
+              </w:rPr>
+              <w:t xml:space="preserve"> </w:t>
+            </w:r>
+            <w:r>
+              <w:rPr>
+                <w:rFonts w:ascii="Times New Roman" w:cs="Times New Roman" w:eastAsia="Times New Roman" w:hAnsi="Times New Roman"/>
+                <w:sz w:val="20"/>
+                <w:szCs w:val="20"/>
+              </w:rPr>
+              <w:t xml:space="preserve">☐ Usage</w:t>
             </w:r>
             <w:r>
               <w:rPr>
@@ -6590,7 +6610,7 @@
                 <w:sz w:val="20"/>
                 <w:szCs w:val="20"/>
               </w:rPr>
-              <w:t xml:space="preserve"/>
+              <w:t xml:space="preserve">Salle de bain</w:t>
             </w:r>
           </w:p>
         </w:tc>
@@ -6619,7 +6639,7 @@
                 <w:sz w:val="20"/>
                 <w:szCs w:val="20"/>
               </w:rPr>
-              <w:t xml:space="preserve">Multi-prise</w:t>
+              <w:t xml:space="preserve">Lavabo</w:t>
             </w:r>
           </w:p>
         </w:tc>
@@ -6807,7 +6827,7 @@
                 <w:sz w:val="20"/>
                 <w:szCs w:val="20"/>
               </w:rPr>
-              <w:t xml:space="preserve">Salle de bain</w:t>
+              <w:t xml:space="preserve"/>
             </w:r>
           </w:p>
         </w:tc>
@@ -6835,7 +6855,7 @@
                 <w:sz w:val="20"/>
                 <w:szCs w:val="20"/>
               </w:rPr>
-              <w:t xml:space="preserve">Lavabo</w:t>
+              <w:t xml:space="preserve">Douche</w:t>
             </w:r>
           </w:p>
         </w:tc>
@@ -6857,6 +6877,22 @@
             <w:vAlign w:val="center"/>
           </w:tcPr>
           <w:p>
+            <w:r>
+              <w:rPr>
+                <w:rFonts w:ascii="Times New Roman" w:cs="Times New Roman" w:eastAsia="Times New Roman" w:hAnsi="Times New Roman"/>
+                <w:sz w:val="20"/>
+                <w:szCs w:val="20"/>
+              </w:rPr>
+              <w:t xml:space="preserve">☐ Bon</w:t>
+            </w:r>
+            <w:r>
+              <w:rPr>
+                <w:rFonts w:ascii="Times New Roman" w:cs="Times New Roman" w:eastAsia="Times New Roman" w:hAnsi="Times New Roman"/>
+                <w:sz w:val="20"/>
+                <w:szCs w:val="20"/>
+              </w:rPr>
+              <w:t xml:space="preserve"> </w:t>
+            </w:r>
             <w:r>
               <w:rPr>
                 <w:rFonts w:ascii="Times New Roman" w:cs="Times New Roman" w:eastAsia="Times New Roman" w:hAnsi="Times New Roman"/>
@@ -6865,23 +6901,7 @@
                 <w:sz w:val="20"/>
                 <w:szCs w:val="20"/>
               </w:rPr>
-              <w:t xml:space="preserve">X Bon</w:t>
-            </w:r>
-            <w:r>
-              <w:rPr>
-                <w:rFonts w:ascii="Times New Roman" w:cs="Times New Roman" w:eastAsia="Times New Roman" w:hAnsi="Times New Roman"/>
-                <w:sz w:val="20"/>
-                <w:szCs w:val="20"/>
-              </w:rPr>
-              <w:t xml:space="preserve"> </w:t>
-            </w:r>
-            <w:r>
-              <w:rPr>
-                <w:rFonts w:ascii="Times New Roman" w:cs="Times New Roman" w:eastAsia="Times New Roman" w:hAnsi="Times New Roman"/>
-                <w:sz w:val="20"/>
-                <w:szCs w:val="20"/>
-              </w:rPr>
-              <w:t xml:space="preserve">☐ Usage</w:t>
+              <w:t xml:space="preserve">X Usage</w:t>
             </w:r>
             <w:r>
               <w:rPr>
@@ -7050,7 +7070,7 @@
                 <w:sz w:val="20"/>
                 <w:szCs w:val="20"/>
               </w:rPr>
-              <w:t xml:space="preserve">Douche</w:t>
+              <w:t xml:space="preserve">WC</w:t>
             </w:r>
           </w:p>
         </w:tc>
@@ -7073,22 +7093,6 @@
             <w:vAlign w:val="center"/>
           </w:tcPr>
           <w:p>
-            <w:r>
-              <w:rPr>
-                <w:rFonts w:ascii="Times New Roman" w:cs="Times New Roman" w:eastAsia="Times New Roman" w:hAnsi="Times New Roman"/>
-                <w:sz w:val="20"/>
-                <w:szCs w:val="20"/>
-              </w:rPr>
-              <w:t xml:space="preserve">☐ Bon</w:t>
-            </w:r>
-            <w:r>
-              <w:rPr>
-                <w:rFonts w:ascii="Times New Roman" w:cs="Times New Roman" w:eastAsia="Times New Roman" w:hAnsi="Times New Roman"/>
-                <w:sz w:val="20"/>
-                <w:szCs w:val="20"/>
-              </w:rPr>
-              <w:t xml:space="preserve"> </w:t>
-            </w:r>
             <w:r>
               <w:rPr>
                 <w:rFonts w:ascii="Times New Roman" w:cs="Times New Roman" w:eastAsia="Times New Roman" w:hAnsi="Times New Roman"/>
@@ -7097,7 +7101,23 @@
                 <w:sz w:val="20"/>
                 <w:szCs w:val="20"/>
               </w:rPr>
-              <w:t xml:space="preserve">X Usage</w:t>
+              <w:t xml:space="preserve">X Bon</w:t>
+            </w:r>
+            <w:r>
+              <w:rPr>
+                <w:rFonts w:ascii="Times New Roman" w:cs="Times New Roman" w:eastAsia="Times New Roman" w:hAnsi="Times New Roman"/>
+                <w:sz w:val="20"/>
+                <w:szCs w:val="20"/>
+              </w:rPr>
+              <w:t xml:space="preserve"> </w:t>
+            </w:r>
+            <w:r>
+              <w:rPr>
+                <w:rFonts w:ascii="Times New Roman" w:cs="Times New Roman" w:eastAsia="Times New Roman" w:hAnsi="Times New Roman"/>
+                <w:sz w:val="20"/>
+                <w:szCs w:val="20"/>
+              </w:rPr>
+              <w:t xml:space="preserve">☐ Usage</w:t>
             </w:r>
             <w:r>
               <w:rPr>
@@ -7266,7 +7286,7 @@
                 <w:sz w:val="20"/>
                 <w:szCs w:val="20"/>
               </w:rPr>
-              <w:t xml:space="preserve">WC</w:t>
+              <w:t xml:space="preserve">Miroir</w:t>
             </w:r>
           </w:p>
         </w:tc>
@@ -7481,7 +7501,7 @@
                 <w:sz w:val="20"/>
                 <w:szCs w:val="20"/>
               </w:rPr>
-              <w:t xml:space="preserve">Miroir</w:t>
+              <w:t xml:space="preserve">Tapis</w:t>
             </w:r>
           </w:p>
         </w:tc>
@@ -7697,7 +7717,7 @@
                 <w:sz w:val="20"/>
                 <w:szCs w:val="20"/>
               </w:rPr>
-              <w:t xml:space="preserve">Tapis</w:t>
+              <w:t xml:space="preserve">Machine à laver</w:t>
             </w:r>
           </w:p>
         </w:tc>
@@ -7912,7 +7932,7 @@
                 <w:sz w:val="20"/>
                 <w:szCs w:val="20"/>
               </w:rPr>
-              <w:t xml:space="preserve">Machine à laver</w:t>
+              <w:t xml:space="preserve">Porte</w:t>
             </w:r>
           </w:p>
         </w:tc>
@@ -7935,6 +7955,22 @@
             <w:vAlign w:val="center"/>
           </w:tcPr>
           <w:p>
+            <w:r>
+              <w:rPr>
+                <w:rFonts w:ascii="Times New Roman" w:cs="Times New Roman" w:eastAsia="Times New Roman" w:hAnsi="Times New Roman"/>
+                <w:sz w:val="20"/>
+                <w:szCs w:val="20"/>
+              </w:rPr>
+              <w:t xml:space="preserve">☐ Bon</w:t>
+            </w:r>
+            <w:r>
+              <w:rPr>
+                <w:rFonts w:ascii="Times New Roman" w:cs="Times New Roman" w:eastAsia="Times New Roman" w:hAnsi="Times New Roman"/>
+                <w:sz w:val="20"/>
+                <w:szCs w:val="20"/>
+              </w:rPr>
+              <w:t xml:space="preserve"> </w:t>
+            </w:r>
             <w:r>
               <w:rPr>
                 <w:rFonts w:ascii="Times New Roman" w:cs="Times New Roman" w:eastAsia="Times New Roman" w:hAnsi="Times New Roman"/>
@@ -7943,23 +7979,7 @@
                 <w:sz w:val="20"/>
                 <w:szCs w:val="20"/>
               </w:rPr>
-              <w:t xml:space="preserve">X Bon</w:t>
-            </w:r>
-            <w:r>
-              <w:rPr>
-                <w:rFonts w:ascii="Times New Roman" w:cs="Times New Roman" w:eastAsia="Times New Roman" w:hAnsi="Times New Roman"/>
-                <w:sz w:val="20"/>
-                <w:szCs w:val="20"/>
-              </w:rPr>
-              <w:t xml:space="preserve"> </w:t>
-            </w:r>
-            <w:r>
-              <w:rPr>
-                <w:rFonts w:ascii="Times New Roman" w:cs="Times New Roman" w:eastAsia="Times New Roman" w:hAnsi="Times New Roman"/>
-                <w:sz w:val="20"/>
-                <w:szCs w:val="20"/>
-              </w:rPr>
-              <w:t xml:space="preserve">☐ Usage</w:t>
+              <w:t xml:space="preserve">X Usage</w:t>
             </w:r>
             <w:r>
               <w:rPr>
@@ -8065,7 +8085,7 @@
                 <w:sz w:val="15"/>
                 <w:szCs w:val="15"/>
               </w:rPr>
-              <w:t xml:space="preserve">RAS</w:t>
+              <w:t xml:space="preserve">Légères craquelures de peinture</w:t>
             </w:r>
           </w:p>
         </w:tc>
@@ -8128,7 +8148,7 @@
                 <w:sz w:val="20"/>
                 <w:szCs w:val="20"/>
               </w:rPr>
-              <w:t xml:space="preserve">Porte</w:t>
+              <w:t xml:space="preserve">Murs</w:t>
             </w:r>
           </w:p>
         </w:tc>
@@ -8278,7 +8298,7 @@
                 <w:sz w:val="15"/>
                 <w:szCs w:val="15"/>
               </w:rPr>
-              <w:t xml:space="preserve">Légères craquelures de peinture</w:t>
+              <w:t xml:space="preserve">Trois impacts visibles sur le mur derrière la porte</w:t>
             </w:r>
           </w:p>
         </w:tc>
@@ -8343,7 +8363,7 @@
                 <w:sz w:val="20"/>
                 <w:szCs w:val="20"/>
               </w:rPr>
-              <w:t xml:space="preserve">Murs</w:t>
+              <w:t xml:space="preserve">Plafond</w:t>
             </w:r>
           </w:p>
         </w:tc>
@@ -8496,7 +8516,7 @@
                 <w:sz w:val="15"/>
                 <w:szCs w:val="15"/>
               </w:rPr>
-              <w:t xml:space="preserve">Trois impacts visibles sur le mur derrière la porte</w:t>
+              <w:t xml:space="preserve">Légères craquelures de peinture</w:t>
             </w:r>
           </w:p>
         </w:tc>
@@ -8531,7 +8551,7 @@
                 <w:sz w:val="20"/>
                 <w:szCs w:val="20"/>
               </w:rPr>
-              <w:t xml:space="preserve"/>
+              <w:t xml:space="preserve">Chambre 2 (côté sdb)</w:t>
             </w:r>
           </w:p>
         </w:tc>
@@ -8559,7 +8579,7 @@
                 <w:sz w:val="20"/>
                 <w:szCs w:val="20"/>
               </w:rPr>
-              <w:t xml:space="preserve">Plafond</w:t>
+              <w:t xml:space="preserve">Porte</w:t>
             </w:r>
           </w:p>
         </w:tc>
@@ -8745,7 +8765,7 @@
                 <w:sz w:val="20"/>
                 <w:szCs w:val="20"/>
               </w:rPr>
-              <w:t xml:space="preserve">Chambre 2 (côté sdb)</w:t>
+              <w:t xml:space="preserve"/>
             </w:r>
           </w:p>
         </w:tc>
@@ -8774,7 +8794,7 @@
                 <w:sz w:val="20"/>
                 <w:szCs w:val="20"/>
               </w:rPr>
-              <w:t xml:space="preserve">Porte</w:t>
+              <w:t xml:space="preserve">Murs</w:t>
             </w:r>
           </w:p>
         </w:tc>
@@ -8797,22 +8817,6 @@
             <w:vAlign w:val="center"/>
           </w:tcPr>
           <w:p>
-            <w:r>
-              <w:rPr>
-                <w:rFonts w:ascii="Times New Roman" w:cs="Times New Roman" w:eastAsia="Times New Roman" w:hAnsi="Times New Roman"/>
-                <w:sz w:val="20"/>
-                <w:szCs w:val="20"/>
-              </w:rPr>
-              <w:t xml:space="preserve">☐ Bon</w:t>
-            </w:r>
-            <w:r>
-              <w:rPr>
-                <w:rFonts w:ascii="Times New Roman" w:cs="Times New Roman" w:eastAsia="Times New Roman" w:hAnsi="Times New Roman"/>
-                <w:sz w:val="20"/>
-                <w:szCs w:val="20"/>
-              </w:rPr>
-              <w:t xml:space="preserve"> </w:t>
-            </w:r>
             <w:r>
               <w:rPr>
                 <w:rFonts w:ascii="Times New Roman" w:cs="Times New Roman" w:eastAsia="Times New Roman" w:hAnsi="Times New Roman"/>
@@ -8821,7 +8825,23 @@
                 <w:sz w:val="20"/>
                 <w:szCs w:val="20"/>
               </w:rPr>
-              <w:t xml:space="preserve">X Usage</w:t>
+              <w:t xml:space="preserve">X Bon</w:t>
+            </w:r>
+            <w:r>
+              <w:rPr>
+                <w:rFonts w:ascii="Times New Roman" w:cs="Times New Roman" w:eastAsia="Times New Roman" w:hAnsi="Times New Roman"/>
+                <w:sz w:val="20"/>
+                <w:szCs w:val="20"/>
+              </w:rPr>
+              <w:t xml:space="preserve"> </w:t>
+            </w:r>
+            <w:r>
+              <w:rPr>
+                <w:rFonts w:ascii="Times New Roman" w:cs="Times New Roman" w:eastAsia="Times New Roman" w:hAnsi="Times New Roman"/>
+                <w:sz w:val="20"/>
+                <w:szCs w:val="20"/>
+              </w:rPr>
+              <w:t xml:space="preserve">☐ Usage</w:t>
             </w:r>
             <w:r>
               <w:rPr>
@@ -8927,7 +8947,7 @@
                 <w:sz w:val="15"/>
                 <w:szCs w:val="15"/>
               </w:rPr>
-              <w:t xml:space="preserve">Légères craquelures de peinture</w:t>
+              <w:t xml:space="preserve">RAS</w:t>
             </w:r>
           </w:p>
         </w:tc>
@@ -8990,7 +9010,7 @@
                 <w:sz w:val="20"/>
                 <w:szCs w:val="20"/>
               </w:rPr>
-              <w:t xml:space="preserve">Murs</w:t>
+              <w:t xml:space="preserve">Plafond</w:t>
             </w:r>
           </w:p>
         </w:tc>
@@ -9012,6 +9032,22 @@
             <w:vAlign w:val="center"/>
           </w:tcPr>
           <w:p>
+            <w:r>
+              <w:rPr>
+                <w:rFonts w:ascii="Times New Roman" w:cs="Times New Roman" w:eastAsia="Times New Roman" w:hAnsi="Times New Roman"/>
+                <w:sz w:val="20"/>
+                <w:szCs w:val="20"/>
+              </w:rPr>
+              <w:t xml:space="preserve">☐ Bon</w:t>
+            </w:r>
+            <w:r>
+              <w:rPr>
+                <w:rFonts w:ascii="Times New Roman" w:cs="Times New Roman" w:eastAsia="Times New Roman" w:hAnsi="Times New Roman"/>
+                <w:sz w:val="20"/>
+                <w:szCs w:val="20"/>
+              </w:rPr>
+              <w:t xml:space="preserve"> </w:t>
+            </w:r>
             <w:r>
               <w:rPr>
                 <w:rFonts w:ascii="Times New Roman" w:cs="Times New Roman" w:eastAsia="Times New Roman" w:hAnsi="Times New Roman"/>
@@ -9020,23 +9056,7 @@
                 <w:sz w:val="20"/>
                 <w:szCs w:val="20"/>
               </w:rPr>
-              <w:t xml:space="preserve">X Bon</w:t>
-            </w:r>
-            <w:r>
-              <w:rPr>
-                <w:rFonts w:ascii="Times New Roman" w:cs="Times New Roman" w:eastAsia="Times New Roman" w:hAnsi="Times New Roman"/>
-                <w:sz w:val="20"/>
-                <w:szCs w:val="20"/>
-              </w:rPr>
-              <w:t xml:space="preserve"> </w:t>
-            </w:r>
-            <w:r>
-              <w:rPr>
-                <w:rFonts w:ascii="Times New Roman" w:cs="Times New Roman" w:eastAsia="Times New Roman" w:hAnsi="Times New Roman"/>
-                <w:sz w:val="20"/>
-                <w:szCs w:val="20"/>
-              </w:rPr>
-              <w:t xml:space="preserve">☐ Usage</w:t>
+              <w:t xml:space="preserve">X Usage</w:t>
             </w:r>
             <w:r>
               <w:rPr>
@@ -9140,7 +9160,7 @@
                 <w:sz w:val="15"/>
                 <w:szCs w:val="15"/>
               </w:rPr>
-              <w:t xml:space="preserve">RAS</w:t>
+              <w:t xml:space="preserve">Légères craquelures de peinture</w:t>
             </w:r>
           </w:p>
         </w:tc>
@@ -9205,7 +9225,7 @@
                 <w:sz w:val="20"/>
                 <w:szCs w:val="20"/>
               </w:rPr>
-              <w:t xml:space="preserve">Plafond</w:t>
+              <w:t xml:space="preserve">Sol (parquet)</w:t>
             </w:r>
           </w:p>
         </w:tc>
@@ -9228,22 +9248,6 @@
             <w:vAlign w:val="center"/>
           </w:tcPr>
           <w:p>
-            <w:r>
-              <w:rPr>
-                <w:rFonts w:ascii="Times New Roman" w:cs="Times New Roman" w:eastAsia="Times New Roman" w:hAnsi="Times New Roman"/>
-                <w:sz w:val="20"/>
-                <w:szCs w:val="20"/>
-              </w:rPr>
-              <w:t xml:space="preserve">☐ Bon</w:t>
-            </w:r>
-            <w:r>
-              <w:rPr>
-                <w:rFonts w:ascii="Times New Roman" w:cs="Times New Roman" w:eastAsia="Times New Roman" w:hAnsi="Times New Roman"/>
-                <w:sz w:val="20"/>
-                <w:szCs w:val="20"/>
-              </w:rPr>
-              <w:t xml:space="preserve"> </w:t>
-            </w:r>
             <w:r>
               <w:rPr>
                 <w:rFonts w:ascii="Times New Roman" w:cs="Times New Roman" w:eastAsia="Times New Roman" w:hAnsi="Times New Roman"/>
@@ -9252,7 +9256,23 @@
                 <w:sz w:val="20"/>
                 <w:szCs w:val="20"/>
               </w:rPr>
-              <w:t xml:space="preserve">X Usage</w:t>
+              <w:t xml:space="preserve">X Bon</w:t>
+            </w:r>
+            <w:r>
+              <w:rPr>
+                <w:rFonts w:ascii="Times New Roman" w:cs="Times New Roman" w:eastAsia="Times New Roman" w:hAnsi="Times New Roman"/>
+                <w:sz w:val="20"/>
+                <w:szCs w:val="20"/>
+              </w:rPr>
+              <w:t xml:space="preserve"> </w:t>
+            </w:r>
+            <w:r>
+              <w:rPr>
+                <w:rFonts w:ascii="Times New Roman" w:cs="Times New Roman" w:eastAsia="Times New Roman" w:hAnsi="Times New Roman"/>
+                <w:sz w:val="20"/>
+                <w:szCs w:val="20"/>
+              </w:rPr>
+              <w:t xml:space="preserve">☐ Usage</w:t>
             </w:r>
             <w:r>
               <w:rPr>
@@ -9358,7 +9378,7 @@
                 <w:sz w:val="15"/>
                 <w:szCs w:val="15"/>
               </w:rPr>
-              <w:t xml:space="preserve">Légères craquelures de peinture</w:t>
+              <w:t xml:space="preserve">RAS</w:t>
             </w:r>
           </w:p>
         </w:tc>
@@ -9421,7 +9441,7 @@
                 <w:sz w:val="20"/>
                 <w:szCs w:val="20"/>
               </w:rPr>
-              <w:t xml:space="preserve">Sol (parquet)</w:t>
+              <w:t xml:space="preserve">Volets</w:t>
             </w:r>
           </w:p>
         </w:tc>
@@ -9636,7 +9656,7 @@
                 <w:sz w:val="20"/>
                 <w:szCs w:val="20"/>
               </w:rPr>
-              <w:t xml:space="preserve">Volets</w:t>
+              <w:t xml:space="preserve">Rideaux occultants</w:t>
             </w:r>
           </w:p>
         </w:tc>
@@ -9659,6 +9679,22 @@
             <w:vAlign w:val="center"/>
           </w:tcPr>
           <w:p>
+            <w:r>
+              <w:rPr>
+                <w:rFonts w:ascii="Times New Roman" w:cs="Times New Roman" w:eastAsia="Times New Roman" w:hAnsi="Times New Roman"/>
+                <w:sz w:val="20"/>
+                <w:szCs w:val="20"/>
+              </w:rPr>
+              <w:t xml:space="preserve">☐ Bon</w:t>
+            </w:r>
+            <w:r>
+              <w:rPr>
+                <w:rFonts w:ascii="Times New Roman" w:cs="Times New Roman" w:eastAsia="Times New Roman" w:hAnsi="Times New Roman"/>
+                <w:sz w:val="20"/>
+                <w:szCs w:val="20"/>
+              </w:rPr>
+              <w:t xml:space="preserve"> </w:t>
+            </w:r>
             <w:r>
               <w:rPr>
                 <w:rFonts w:ascii="Times New Roman" w:cs="Times New Roman" w:eastAsia="Times New Roman" w:hAnsi="Times New Roman"/>
@@ -9667,23 +9703,7 @@
                 <w:sz w:val="20"/>
                 <w:szCs w:val="20"/>
               </w:rPr>
-              <w:t xml:space="preserve">X Bon</w:t>
-            </w:r>
-            <w:r>
-              <w:rPr>
-                <w:rFonts w:ascii="Times New Roman" w:cs="Times New Roman" w:eastAsia="Times New Roman" w:hAnsi="Times New Roman"/>
-                <w:sz w:val="20"/>
-                <w:szCs w:val="20"/>
-              </w:rPr>
-              <w:t xml:space="preserve"> </w:t>
-            </w:r>
-            <w:r>
-              <w:rPr>
-                <w:rFonts w:ascii="Times New Roman" w:cs="Times New Roman" w:eastAsia="Times New Roman" w:hAnsi="Times New Roman"/>
-                <w:sz w:val="20"/>
-                <w:szCs w:val="20"/>
-              </w:rPr>
-              <w:t xml:space="preserve">☐ Usage</w:t>
+              <w:t xml:space="preserve">X Usage</w:t>
             </w:r>
             <w:r>
               <w:rPr>
@@ -9789,7 +9809,7 @@
                 <w:sz w:val="15"/>
                 <w:szCs w:val="15"/>
               </w:rPr>
-              <w:t xml:space="preserve">RAS</w:t>
+              <w:t xml:space="preserve">Légère décoloration</w:t>
             </w:r>
           </w:p>
         </w:tc>
@@ -9852,7 +9872,7 @@
                 <w:sz w:val="20"/>
                 <w:szCs w:val="20"/>
               </w:rPr>
-              <w:t xml:space="preserve">Rideaux occultants</w:t>
+              <w:t xml:space="preserve">Lit</w:t>
             </w:r>
           </w:p>
         </w:tc>
@@ -9874,22 +9894,6 @@
             <w:vAlign w:val="center"/>
           </w:tcPr>
           <w:p>
-            <w:r>
-              <w:rPr>
-                <w:rFonts w:ascii="Times New Roman" w:cs="Times New Roman" w:eastAsia="Times New Roman" w:hAnsi="Times New Roman"/>
-                <w:sz w:val="20"/>
-                <w:szCs w:val="20"/>
-              </w:rPr>
-              <w:t xml:space="preserve">☐ Bon</w:t>
-            </w:r>
-            <w:r>
-              <w:rPr>
-                <w:rFonts w:ascii="Times New Roman" w:cs="Times New Roman" w:eastAsia="Times New Roman" w:hAnsi="Times New Roman"/>
-                <w:sz w:val="20"/>
-                <w:szCs w:val="20"/>
-              </w:rPr>
-              <w:t xml:space="preserve"> </w:t>
-            </w:r>
             <w:r>
               <w:rPr>
                 <w:rFonts w:ascii="Times New Roman" w:cs="Times New Roman" w:eastAsia="Times New Roman" w:hAnsi="Times New Roman"/>
@@ -9898,7 +9902,23 @@
                 <w:sz w:val="20"/>
                 <w:szCs w:val="20"/>
               </w:rPr>
-              <w:t xml:space="preserve">X Usage</w:t>
+              <w:t xml:space="preserve">X Bon</w:t>
+            </w:r>
+            <w:r>
+              <w:rPr>
+                <w:rFonts w:ascii="Times New Roman" w:cs="Times New Roman" w:eastAsia="Times New Roman" w:hAnsi="Times New Roman"/>
+                <w:sz w:val="20"/>
+                <w:szCs w:val="20"/>
+              </w:rPr>
+              <w:t xml:space="preserve"> </w:t>
+            </w:r>
+            <w:r>
+              <w:rPr>
+                <w:rFonts w:ascii="Times New Roman" w:cs="Times New Roman" w:eastAsia="Times New Roman" w:hAnsi="Times New Roman"/>
+                <w:sz w:val="20"/>
+                <w:szCs w:val="20"/>
+              </w:rPr>
+              <w:t xml:space="preserve">☐ Usage</w:t>
             </w:r>
             <w:r>
               <w:rPr>
@@ -10002,7 +10022,7 @@
                 <w:sz w:val="15"/>
                 <w:szCs w:val="15"/>
               </w:rPr>
-              <w:t xml:space="preserve">Légère décoloration</w:t>
+              <w:t xml:space="preserve">RAS</w:t>
             </w:r>
           </w:p>
         </w:tc>
@@ -10067,7 +10087,7 @@
                 <w:sz w:val="20"/>
                 <w:szCs w:val="20"/>
               </w:rPr>
-              <w:t xml:space="preserve">Lit</w:t>
+              <w:t xml:space="preserve">Matelas</w:t>
             </w:r>
           </w:p>
         </w:tc>
@@ -10283,7 +10303,7 @@
                 <w:sz w:val="20"/>
                 <w:szCs w:val="20"/>
               </w:rPr>
-              <w:t xml:space="preserve">Matelas</w:t>
+              <w:t xml:space="preserve">2 oreillers + couette</w:t>
             </w:r>
           </w:p>
         </w:tc>
@@ -10498,7 +10518,7 @@
                 <w:sz w:val="20"/>
                 <w:szCs w:val="20"/>
               </w:rPr>
-              <w:t xml:space="preserve">2 oreillers + couette</w:t>
+              <w:t xml:space="preserve">Parure de lit n°1 (1 drap + 1 housse de couette + 2 taies d’oreillers + 1 protège-matelas)</w:t>
             </w:r>
           </w:p>
         </w:tc>
@@ -10714,7 +10734,7 @@
                 <w:sz w:val="20"/>
                 <w:szCs w:val="20"/>
               </w:rPr>
-              <w:t xml:space="preserve">Parure de lit n°1 (1 drap + 1 housse de couette + 2 taies d’oreillers + 1 protège-matelas)</w:t>
+              <w:t xml:space="preserve">Parure de lit n°2 (1 drap + 1 housse de couette + 2 taies d’oreillers + 1 protège-matelas)</w:t>
             </w:r>
           </w:p>
         </w:tc>
@@ -10929,7 +10949,7 @@
                 <w:sz w:val="20"/>
                 <w:szCs w:val="20"/>
               </w:rPr>
-              <w:t xml:space="preserve">Parure de lit n°2 (1 drap + 1 housse de couette + 2 taies d’oreillers + 1 protège-matelas)</w:t>
+              <w:t xml:space="preserve">Bureau avec étagères</w:t>
             </w:r>
           </w:p>
         </w:tc>
@@ -11145,7 +11165,7 @@
                 <w:sz w:val="20"/>
                 <w:szCs w:val="20"/>
               </w:rPr>
-              <w:t xml:space="preserve">Bureau avec étagères</w:t>
+              <w:t xml:space="preserve">Chaise</w:t>
             </w:r>
           </w:p>
         </w:tc>
@@ -11360,7 +11380,7 @@
                 <w:sz w:val="20"/>
                 <w:szCs w:val="20"/>
               </w:rPr>
-              <w:t xml:space="preserve">Chaise</w:t>
+              <w:t xml:space="preserve">Coussin jaune sur chaise</w:t>
             </w:r>
           </w:p>
         </w:tc>
@@ -11576,7 +11596,7 @@
                 <w:sz w:val="20"/>
                 <w:szCs w:val="20"/>
               </w:rPr>
-              <w:t xml:space="preserve">Coussin jaune sur chaise</w:t>
+              <w:t xml:space="preserve">Armoire dressing</w:t>
             </w:r>
           </w:p>
         </w:tc>
@@ -11791,7 +11811,7 @@
                 <w:sz w:val="20"/>
                 <w:szCs w:val="20"/>
               </w:rPr>
-              <w:t xml:space="preserve">Armoire dressing</w:t>
+              <w:t xml:space="preserve">20 cintres noirs velours</w:t>
             </w:r>
           </w:p>
         </w:tc>
@@ -11979,7 +11999,7 @@
                 <w:sz w:val="20"/>
                 <w:szCs w:val="20"/>
               </w:rPr>
-              <w:t xml:space="preserve"/>
+              <w:t xml:space="preserve">Chambre 1 (côté salon)</w:t>
             </w:r>
           </w:p>
         </w:tc>
@@ -12007,7 +12027,7 @@
                 <w:sz w:val="20"/>
                 <w:szCs w:val="20"/>
               </w:rPr>
-              <w:t xml:space="preserve">20 cintres noirs velours</w:t>
+              <w:t xml:space="preserve">Porte</w:t>
             </w:r>
           </w:p>
         </w:tc>
@@ -12029,6 +12049,22 @@
             <w:vAlign w:val="center"/>
           </w:tcPr>
           <w:p>
+            <w:r>
+              <w:rPr>
+                <w:rFonts w:ascii="Times New Roman" w:cs="Times New Roman" w:eastAsia="Times New Roman" w:hAnsi="Times New Roman"/>
+                <w:sz w:val="20"/>
+                <w:szCs w:val="20"/>
+              </w:rPr>
+              <w:t xml:space="preserve">☐ Bon</w:t>
+            </w:r>
+            <w:r>
+              <w:rPr>
+                <w:rFonts w:ascii="Times New Roman" w:cs="Times New Roman" w:eastAsia="Times New Roman" w:hAnsi="Times New Roman"/>
+                <w:sz w:val="20"/>
+                <w:szCs w:val="20"/>
+              </w:rPr>
+              <w:t xml:space="preserve"> </w:t>
+            </w:r>
             <w:r>
               <w:rPr>
                 <w:rFonts w:ascii="Times New Roman" w:cs="Times New Roman" w:eastAsia="Times New Roman" w:hAnsi="Times New Roman"/>
@@ -12037,23 +12073,7 @@
                 <w:sz w:val="20"/>
                 <w:szCs w:val="20"/>
               </w:rPr>
-              <w:t xml:space="preserve">X Bon</w:t>
-            </w:r>
-            <w:r>
-              <w:rPr>
-                <w:rFonts w:ascii="Times New Roman" w:cs="Times New Roman" w:eastAsia="Times New Roman" w:hAnsi="Times New Roman"/>
-                <w:sz w:val="20"/>
-                <w:szCs w:val="20"/>
-              </w:rPr>
-              <w:t xml:space="preserve"> </w:t>
-            </w:r>
-            <w:r>
-              <w:rPr>
-                <w:rFonts w:ascii="Times New Roman" w:cs="Times New Roman" w:eastAsia="Times New Roman" w:hAnsi="Times New Roman"/>
-                <w:sz w:val="20"/>
-                <w:szCs w:val="20"/>
-              </w:rPr>
-              <w:t xml:space="preserve">☐ Usage</w:t>
+              <w:t xml:space="preserve">X Usage</w:t>
             </w:r>
             <w:r>
               <w:rPr>
@@ -12157,7 +12177,7 @@
                 <w:sz w:val="15"/>
                 <w:szCs w:val="15"/>
               </w:rPr>
-              <w:t xml:space="preserve">RAS</w:t>
+              <w:t xml:space="preserve">Légères craquelures de peinture</w:t>
             </w:r>
           </w:p>
         </w:tc>
@@ -12193,7 +12213,7 @@
                 <w:sz w:val="20"/>
                 <w:szCs w:val="20"/>
               </w:rPr>
-              <w:t xml:space="preserve">Chambre 1 (côté salon)</w:t>
+              <w:t xml:space="preserve"/>
             </w:r>
           </w:p>
         </w:tc>
@@ -12222,7 +12242,7 @@
                 <w:sz w:val="20"/>
                 <w:szCs w:val="20"/>
               </w:rPr>
-              <w:t xml:space="preserve">Porte</w:t>
+              <w:t xml:space="preserve">Murs</w:t>
             </w:r>
           </w:p>
         </w:tc>
@@ -12375,7 +12395,7 @@
                 <w:sz w:val="15"/>
                 <w:szCs w:val="15"/>
               </w:rPr>
-              <w:t xml:space="preserve">Légères craquelures de peinture</w:t>
+              <w:t xml:space="preserve">Décoloration grisâtre et traces diffuses sur un pan de mur</w:t>
             </w:r>
           </w:p>
         </w:tc>
@@ -12438,7 +12458,7 @@
                 <w:sz w:val="20"/>
                 <w:szCs w:val="20"/>
               </w:rPr>
-              <w:t xml:space="preserve">Murs</w:t>
+              <w:t xml:space="preserve">Plafond</w:t>
             </w:r>
           </w:p>
         </w:tc>
@@ -12588,7 +12608,7 @@
                 <w:sz w:val="15"/>
                 <w:szCs w:val="15"/>
               </w:rPr>
-              <w:t xml:space="preserve">Décoloration grisâtre et traces diffuses sur un pan de mur</w:t>
+              <w:t xml:space="preserve">Légères craquelures de peinture</w:t>
             </w:r>
           </w:p>
         </w:tc>
@@ -12653,7 +12673,7 @@
                 <w:sz w:val="20"/>
                 <w:szCs w:val="20"/>
               </w:rPr>
-              <w:t xml:space="preserve">Plafond</w:t>
+              <w:t xml:space="preserve">Sol (parquet)</w:t>
             </w:r>
           </w:p>
         </w:tc>
@@ -12676,22 +12696,6 @@
             <w:vAlign w:val="center"/>
           </w:tcPr>
           <w:p>
-            <w:r>
-              <w:rPr>
-                <w:rFonts w:ascii="Times New Roman" w:cs="Times New Roman" w:eastAsia="Times New Roman" w:hAnsi="Times New Roman"/>
-                <w:sz w:val="20"/>
-                <w:szCs w:val="20"/>
-              </w:rPr>
-              <w:t xml:space="preserve">☐ Bon</w:t>
-            </w:r>
-            <w:r>
-              <w:rPr>
-                <w:rFonts w:ascii="Times New Roman" w:cs="Times New Roman" w:eastAsia="Times New Roman" w:hAnsi="Times New Roman"/>
-                <w:sz w:val="20"/>
-                <w:szCs w:val="20"/>
-              </w:rPr>
-              <w:t xml:space="preserve"> </w:t>
-            </w:r>
             <w:r>
               <w:rPr>
                 <w:rFonts w:ascii="Times New Roman" w:cs="Times New Roman" w:eastAsia="Times New Roman" w:hAnsi="Times New Roman"/>
@@ -12700,7 +12704,23 @@
                 <w:sz w:val="20"/>
                 <w:szCs w:val="20"/>
               </w:rPr>
-              <w:t xml:space="preserve">X Usage</w:t>
+              <w:t xml:space="preserve">X Bon</w:t>
+            </w:r>
+            <w:r>
+              <w:rPr>
+                <w:rFonts w:ascii="Times New Roman" w:cs="Times New Roman" w:eastAsia="Times New Roman" w:hAnsi="Times New Roman"/>
+                <w:sz w:val="20"/>
+                <w:szCs w:val="20"/>
+              </w:rPr>
+              <w:t xml:space="preserve"> </w:t>
+            </w:r>
+            <w:r>
+              <w:rPr>
+                <w:rFonts w:ascii="Times New Roman" w:cs="Times New Roman" w:eastAsia="Times New Roman" w:hAnsi="Times New Roman"/>
+                <w:sz w:val="20"/>
+                <w:szCs w:val="20"/>
+              </w:rPr>
+              <w:t xml:space="preserve">☐ Usage</w:t>
             </w:r>
             <w:r>
               <w:rPr>
@@ -12806,7 +12826,7 @@
                 <w:sz w:val="15"/>
                 <w:szCs w:val="15"/>
               </w:rPr>
-              <w:t xml:space="preserve">Légères craquelures de peinture</w:t>
+              <w:t xml:space="preserve">RAS</w:t>
             </w:r>
           </w:p>
         </w:tc>
@@ -12869,7 +12889,7 @@
                 <w:sz w:val="20"/>
                 <w:szCs w:val="20"/>
               </w:rPr>
-              <w:t xml:space="preserve">Sol (parquet)</w:t>
+              <w:t xml:space="preserve">Volets</w:t>
             </w:r>
           </w:p>
         </w:tc>
@@ -13084,7 +13104,7 @@
                 <w:sz w:val="20"/>
                 <w:szCs w:val="20"/>
               </w:rPr>
-              <w:t xml:space="preserve">Volets</w:t>
+              <w:t xml:space="preserve">Rideaux occultants</w:t>
             </w:r>
           </w:p>
         </w:tc>
@@ -13107,6 +13127,22 @@
             <w:vAlign w:val="center"/>
           </w:tcPr>
           <w:p>
+            <w:r>
+              <w:rPr>
+                <w:rFonts w:ascii="Times New Roman" w:cs="Times New Roman" w:eastAsia="Times New Roman" w:hAnsi="Times New Roman"/>
+                <w:sz w:val="20"/>
+                <w:szCs w:val="20"/>
+              </w:rPr>
+              <w:t xml:space="preserve">☐ Bon</w:t>
+            </w:r>
+            <w:r>
+              <w:rPr>
+                <w:rFonts w:ascii="Times New Roman" w:cs="Times New Roman" w:eastAsia="Times New Roman" w:hAnsi="Times New Roman"/>
+                <w:sz w:val="20"/>
+                <w:szCs w:val="20"/>
+              </w:rPr>
+              <w:t xml:space="preserve"> </w:t>
+            </w:r>
             <w:r>
               <w:rPr>
                 <w:rFonts w:ascii="Times New Roman" w:cs="Times New Roman" w:eastAsia="Times New Roman" w:hAnsi="Times New Roman"/>
@@ -13115,23 +13151,7 @@
                 <w:sz w:val="20"/>
                 <w:szCs w:val="20"/>
               </w:rPr>
-              <w:t xml:space="preserve">X Bon</w:t>
-            </w:r>
-            <w:r>
-              <w:rPr>
-                <w:rFonts w:ascii="Times New Roman" w:cs="Times New Roman" w:eastAsia="Times New Roman" w:hAnsi="Times New Roman"/>
-                <w:sz w:val="20"/>
-                <w:szCs w:val="20"/>
-              </w:rPr>
-              <w:t xml:space="preserve"> </w:t>
-            </w:r>
-            <w:r>
-              <w:rPr>
-                <w:rFonts w:ascii="Times New Roman" w:cs="Times New Roman" w:eastAsia="Times New Roman" w:hAnsi="Times New Roman"/>
-                <w:sz w:val="20"/>
-                <w:szCs w:val="20"/>
-              </w:rPr>
-              <w:t xml:space="preserve">☐ Usage</w:t>
+              <w:t xml:space="preserve">X Usage</w:t>
             </w:r>
             <w:r>
               <w:rPr>
@@ -13300,7 +13320,7 @@
                 <w:sz w:val="20"/>
                 <w:szCs w:val="20"/>
               </w:rPr>
-              <w:t xml:space="preserve">Rideaux occultants</w:t>
+              <w:t xml:space="preserve">Lit</w:t>
             </w:r>
           </w:p>
         </w:tc>
@@ -13450,7 +13470,7 @@
                 <w:sz w:val="15"/>
                 <w:szCs w:val="15"/>
               </w:rPr>
-              <w:t xml:space="preserve">RAS</w:t>
+              <w:t xml:space="preserve">Petites taches sur les planches de la colonne du lit ; traces de liquide sur les lattes en bois ; une vis manquante</w:t>
             </w:r>
           </w:p>
         </w:tc>
@@ -13515,7 +13535,7 @@
                 <w:sz w:val="20"/>
                 <w:szCs w:val="20"/>
               </w:rPr>
-              <w:t xml:space="preserve">Lit</w:t>
+              <w:t xml:space="preserve">Tiroirs du lit x3</w:t>
             </w:r>
           </w:p>
         </w:tc>
@@ -13545,6 +13565,22 @@
                 <w:szCs w:val="20"/>
               </w:rPr>
               <w:t xml:space="preserve">☐ Bon</w:t>
+            </w:r>
+            <w:r>
+              <w:rPr>
+                <w:rFonts w:ascii="Times New Roman" w:cs="Times New Roman" w:eastAsia="Times New Roman" w:hAnsi="Times New Roman"/>
+                <w:sz w:val="20"/>
+                <w:szCs w:val="20"/>
+              </w:rPr>
+              <w:t xml:space="preserve"> </w:t>
+            </w:r>
+            <w:r>
+              <w:rPr>
+                <w:rFonts w:ascii="Times New Roman" w:cs="Times New Roman" w:eastAsia="Times New Roman" w:hAnsi="Times New Roman"/>
+                <w:sz w:val="20"/>
+                <w:szCs w:val="20"/>
+              </w:rPr>
+              <w:t xml:space="preserve">☐ Usage</w:t>
             </w:r>
             <w:r>
               <w:rPr>
@@ -13562,23 +13598,7 @@
                 <w:sz w:val="20"/>
                 <w:szCs w:val="20"/>
               </w:rPr>
-              <w:t xml:space="preserve">X Usage</w:t>
-            </w:r>
-            <w:r>
-              <w:rPr>
-                <w:rFonts w:ascii="Times New Roman" w:cs="Times New Roman" w:eastAsia="Times New Roman" w:hAnsi="Times New Roman"/>
-                <w:sz w:val="20"/>
-                <w:szCs w:val="20"/>
-              </w:rPr>
-              <w:t xml:space="preserve"> </w:t>
-            </w:r>
-            <w:r>
-              <w:rPr>
-                <w:rFonts w:ascii="Times New Roman" w:cs="Times New Roman" w:eastAsia="Times New Roman" w:hAnsi="Times New Roman"/>
-                <w:sz w:val="20"/>
-                <w:szCs w:val="20"/>
-              </w:rPr>
-              <w:t xml:space="preserve">☐ Mauvais</w:t>
+              <w:t xml:space="preserve">X Mauvais</w:t>
             </w:r>
           </w:p>
         </w:tc>
@@ -13668,7 +13688,7 @@
                 <w:sz w:val="15"/>
                 <w:szCs w:val="15"/>
               </w:rPr>
-              <w:t xml:space="preserve">Petites taches sur les planches de la colonne du lit ; traces de liquide sur les lattes en bois ; une vis manquante</w:t>
+              <w:t xml:space="preserve">Tiroir 1 : glissière métallique désolidarisée de son logement. Tiroir 2 : fixation/coulisse latérale endommagée. Tiroir 3 : bois détérioré par du liquide/humidité</w:t>
             </w:r>
           </w:p>
         </w:tc>
@@ -13731,7 +13751,7 @@
                 <w:sz w:val="20"/>
                 <w:szCs w:val="20"/>
               </w:rPr>
-              <w:t xml:space="preserve">Tiroirs du lit x3</w:t>
+              <w:t xml:space="preserve">Matelas</w:t>
             </w:r>
           </w:p>
         </w:tc>
@@ -13753,38 +13773,6 @@
             <w:vAlign w:val="center"/>
           </w:tcPr>
           <w:p>
-            <w:r>
-              <w:rPr>
-                <w:rFonts w:ascii="Times New Roman" w:cs="Times New Roman" w:eastAsia="Times New Roman" w:hAnsi="Times New Roman"/>
-                <w:sz w:val="20"/>
-                <w:szCs w:val="20"/>
-              </w:rPr>
-              <w:t xml:space="preserve">☐ Bon</w:t>
-            </w:r>
-            <w:r>
-              <w:rPr>
-                <w:rFonts w:ascii="Times New Roman" w:cs="Times New Roman" w:eastAsia="Times New Roman" w:hAnsi="Times New Roman"/>
-                <w:sz w:val="20"/>
-                <w:szCs w:val="20"/>
-              </w:rPr>
-              <w:t xml:space="preserve"> </w:t>
-            </w:r>
-            <w:r>
-              <w:rPr>
-                <w:rFonts w:ascii="Times New Roman" w:cs="Times New Roman" w:eastAsia="Times New Roman" w:hAnsi="Times New Roman"/>
-                <w:sz w:val="20"/>
-                <w:szCs w:val="20"/>
-              </w:rPr>
-              <w:t xml:space="preserve">☐ Usage</w:t>
-            </w:r>
-            <w:r>
-              <w:rPr>
-                <w:rFonts w:ascii="Times New Roman" w:cs="Times New Roman" w:eastAsia="Times New Roman" w:hAnsi="Times New Roman"/>
-                <w:sz w:val="20"/>
-                <w:szCs w:val="20"/>
-              </w:rPr>
-              <w:t xml:space="preserve"> </w:t>
-            </w:r>
             <w:r>
               <w:rPr>
                 <w:rFonts w:ascii="Times New Roman" w:cs="Times New Roman" w:eastAsia="Times New Roman" w:hAnsi="Times New Roman"/>
@@ -13793,7 +13781,39 @@
                 <w:sz w:val="20"/>
                 <w:szCs w:val="20"/>
               </w:rPr>
-              <w:t xml:space="preserve">X Mauvais</w:t>
+              <w:t xml:space="preserve">X Bon</w:t>
+            </w:r>
+            <w:r>
+              <w:rPr>
+                <w:rFonts w:ascii="Times New Roman" w:cs="Times New Roman" w:eastAsia="Times New Roman" w:hAnsi="Times New Roman"/>
+                <w:sz w:val="20"/>
+                <w:szCs w:val="20"/>
+              </w:rPr>
+              <w:t xml:space="preserve"> </w:t>
+            </w:r>
+            <w:r>
+              <w:rPr>
+                <w:rFonts w:ascii="Times New Roman" w:cs="Times New Roman" w:eastAsia="Times New Roman" w:hAnsi="Times New Roman"/>
+                <w:sz w:val="20"/>
+                <w:szCs w:val="20"/>
+              </w:rPr>
+              <w:t xml:space="preserve">☐ Usage</w:t>
+            </w:r>
+            <w:r>
+              <w:rPr>
+                <w:rFonts w:ascii="Times New Roman" w:cs="Times New Roman" w:eastAsia="Times New Roman" w:hAnsi="Times New Roman"/>
+                <w:sz w:val="20"/>
+                <w:szCs w:val="20"/>
+              </w:rPr>
+              <w:t xml:space="preserve"> </w:t>
+            </w:r>
+            <w:r>
+              <w:rPr>
+                <w:rFonts w:ascii="Times New Roman" w:cs="Times New Roman" w:eastAsia="Times New Roman" w:hAnsi="Times New Roman"/>
+                <w:sz w:val="20"/>
+                <w:szCs w:val="20"/>
+              </w:rPr>
+              <w:t xml:space="preserve">☐ Mauvais</w:t>
             </w:r>
           </w:p>
         </w:tc>
@@ -13881,7 +13901,7 @@
                 <w:sz w:val="15"/>
                 <w:szCs w:val="15"/>
               </w:rPr>
-              <w:t xml:space="preserve">Tiroir 1 : glissière métallique désolidarisée de son logement. Tiroir 2 : fixation/coulisse latérale endommagée. Tiroir 3 : bois détérioré par du liquide/humidité</w:t>
+              <w:t xml:space="preserve">RAS</w:t>
             </w:r>
           </w:p>
         </w:tc>
@@ -13946,7 +13966,7 @@
                 <w:sz w:val="20"/>
                 <w:szCs w:val="20"/>
               </w:rPr>
-              <w:t xml:space="preserve">Matelas</w:t>
+              <w:t xml:space="preserve">2 oreillers + couette</w:t>
             </w:r>
           </w:p>
         </w:tc>
@@ -13969,6 +13989,22 @@
             <w:vAlign w:val="center"/>
           </w:tcPr>
           <w:p>
+            <w:r>
+              <w:rPr>
+                <w:rFonts w:ascii="Times New Roman" w:cs="Times New Roman" w:eastAsia="Times New Roman" w:hAnsi="Times New Roman"/>
+                <w:sz w:val="20"/>
+                <w:szCs w:val="20"/>
+              </w:rPr>
+              <w:t xml:space="preserve">☐ Bon</w:t>
+            </w:r>
+            <w:r>
+              <w:rPr>
+                <w:rFonts w:ascii="Times New Roman" w:cs="Times New Roman" w:eastAsia="Times New Roman" w:hAnsi="Times New Roman"/>
+                <w:sz w:val="20"/>
+                <w:szCs w:val="20"/>
+              </w:rPr>
+              <w:t xml:space="preserve"> </w:t>
+            </w:r>
             <w:r>
               <w:rPr>
                 <w:rFonts w:ascii="Times New Roman" w:cs="Times New Roman" w:eastAsia="Times New Roman" w:hAnsi="Times New Roman"/>
@@ -13977,23 +14013,7 @@
                 <w:sz w:val="20"/>
                 <w:szCs w:val="20"/>
               </w:rPr>
-              <w:t xml:space="preserve">X Bon</w:t>
-            </w:r>
-            <w:r>
-              <w:rPr>
-                <w:rFonts w:ascii="Times New Roman" w:cs="Times New Roman" w:eastAsia="Times New Roman" w:hAnsi="Times New Roman"/>
-                <w:sz w:val="20"/>
-                <w:szCs w:val="20"/>
-              </w:rPr>
-              <w:t xml:space="preserve"> </w:t>
-            </w:r>
-            <w:r>
-              <w:rPr>
-                <w:rFonts w:ascii="Times New Roman" w:cs="Times New Roman" w:eastAsia="Times New Roman" w:hAnsi="Times New Roman"/>
-                <w:sz w:val="20"/>
-                <w:szCs w:val="20"/>
-              </w:rPr>
-              <w:t xml:space="preserve">☐ Usage</w:t>
+              <w:t xml:space="preserve">X Usage</w:t>
             </w:r>
             <w:r>
               <w:rPr>
@@ -14162,7 +14182,7 @@
                 <w:sz w:val="20"/>
                 <w:szCs w:val="20"/>
               </w:rPr>
-              <w:t xml:space="preserve">2 oreillers + couette</w:t>
+              <w:t xml:space="preserve">Parure de lit n°1 (1 drap + 1 housse de couette + 2 taies d’oreillers + 1 protège-matelas)</w:t>
             </w:r>
           </w:p>
         </w:tc>
@@ -14184,22 +14204,6 @@
             <w:vAlign w:val="center"/>
           </w:tcPr>
           <w:p>
-            <w:r>
-              <w:rPr>
-                <w:rFonts w:ascii="Times New Roman" w:cs="Times New Roman" w:eastAsia="Times New Roman" w:hAnsi="Times New Roman"/>
-                <w:sz w:val="20"/>
-                <w:szCs w:val="20"/>
-              </w:rPr>
-              <w:t xml:space="preserve">☐ Bon</w:t>
-            </w:r>
-            <w:r>
-              <w:rPr>
-                <w:rFonts w:ascii="Times New Roman" w:cs="Times New Roman" w:eastAsia="Times New Roman" w:hAnsi="Times New Roman"/>
-                <w:sz w:val="20"/>
-                <w:szCs w:val="20"/>
-              </w:rPr>
-              <w:t xml:space="preserve"> </w:t>
-            </w:r>
             <w:r>
               <w:rPr>
                 <w:rFonts w:ascii="Times New Roman" w:cs="Times New Roman" w:eastAsia="Times New Roman" w:hAnsi="Times New Roman"/>
@@ -14208,7 +14212,23 @@
                 <w:sz w:val="20"/>
                 <w:szCs w:val="20"/>
               </w:rPr>
-              <w:t xml:space="preserve">X Usage</w:t>
+              <w:t xml:space="preserve">X Bon</w:t>
+            </w:r>
+            <w:r>
+              <w:rPr>
+                <w:rFonts w:ascii="Times New Roman" w:cs="Times New Roman" w:eastAsia="Times New Roman" w:hAnsi="Times New Roman"/>
+                <w:sz w:val="20"/>
+                <w:szCs w:val="20"/>
+              </w:rPr>
+              <w:t xml:space="preserve"> </w:t>
+            </w:r>
+            <w:r>
+              <w:rPr>
+                <w:rFonts w:ascii="Times New Roman" w:cs="Times New Roman" w:eastAsia="Times New Roman" w:hAnsi="Times New Roman"/>
+                <w:sz w:val="20"/>
+                <w:szCs w:val="20"/>
+              </w:rPr>
+              <w:t xml:space="preserve">☐ Usage</w:t>
             </w:r>
             <w:r>
               <w:rPr>
@@ -14377,7 +14397,7 @@
                 <w:sz w:val="20"/>
                 <w:szCs w:val="20"/>
               </w:rPr>
-              <w:t xml:space="preserve">Parure de lit n°1 (1 drap + 1 housse de couette + 2 taies d’oreillers + 1 protège-matelas)</w:t>
+              <w:t xml:space="preserve">Parure de lit n°2 (1 drap + 1 housse de couette + 2 taies d’oreillers + 1 protège-matelas)</w:t>
             </w:r>
           </w:p>
         </w:tc>
@@ -14593,7 +14613,7 @@
                 <w:sz w:val="20"/>
                 <w:szCs w:val="20"/>
               </w:rPr>
-              <w:t xml:space="preserve">Parure de lit n°2 (1 drap + 1 housse de couette + 2 taies d’oreillers + 1 protège-matelas)</w:t>
+              <w:t xml:space="preserve">Bureau</w:t>
             </w:r>
           </w:p>
         </w:tc>
@@ -14615,6 +14635,22 @@
             <w:vAlign w:val="center"/>
           </w:tcPr>
           <w:p>
+            <w:r>
+              <w:rPr>
+                <w:rFonts w:ascii="Times New Roman" w:cs="Times New Roman" w:eastAsia="Times New Roman" w:hAnsi="Times New Roman"/>
+                <w:sz w:val="20"/>
+                <w:szCs w:val="20"/>
+              </w:rPr>
+              <w:t xml:space="preserve">☐ Bon</w:t>
+            </w:r>
+            <w:r>
+              <w:rPr>
+                <w:rFonts w:ascii="Times New Roman" w:cs="Times New Roman" w:eastAsia="Times New Roman" w:hAnsi="Times New Roman"/>
+                <w:sz w:val="20"/>
+                <w:szCs w:val="20"/>
+              </w:rPr>
+              <w:t xml:space="preserve"> </w:t>
+            </w:r>
             <w:r>
               <w:rPr>
                 <w:rFonts w:ascii="Times New Roman" w:cs="Times New Roman" w:eastAsia="Times New Roman" w:hAnsi="Times New Roman"/>
@@ -14623,23 +14659,7 @@
                 <w:sz w:val="20"/>
                 <w:szCs w:val="20"/>
               </w:rPr>
-              <w:t xml:space="preserve">X Bon</w:t>
-            </w:r>
-            <w:r>
-              <w:rPr>
-                <w:rFonts w:ascii="Times New Roman" w:cs="Times New Roman" w:eastAsia="Times New Roman" w:hAnsi="Times New Roman"/>
-                <w:sz w:val="20"/>
-                <w:szCs w:val="20"/>
-              </w:rPr>
-              <w:t xml:space="preserve"> </w:t>
-            </w:r>
-            <w:r>
-              <w:rPr>
-                <w:rFonts w:ascii="Times New Roman" w:cs="Times New Roman" w:eastAsia="Times New Roman" w:hAnsi="Times New Roman"/>
-                <w:sz w:val="20"/>
-                <w:szCs w:val="20"/>
-              </w:rPr>
-              <w:t xml:space="preserve">☐ Usage</w:t>
+              <w:t xml:space="preserve">X Usage</w:t>
             </w:r>
             <w:r>
               <w:rPr>
@@ -14808,7 +14828,7 @@
                 <w:sz w:val="20"/>
                 <w:szCs w:val="20"/>
               </w:rPr>
-              <w:t xml:space="preserve">Bureau</w:t>
+              <w:t xml:space="preserve">Chaise de bureau</w:t>
             </w:r>
           </w:p>
         </w:tc>
@@ -14838,6 +14858,22 @@
                 <w:szCs w:val="20"/>
               </w:rPr>
               <w:t xml:space="preserve">☐ Bon</w:t>
+            </w:r>
+            <w:r>
+              <w:rPr>
+                <w:rFonts w:ascii="Times New Roman" w:cs="Times New Roman" w:eastAsia="Times New Roman" w:hAnsi="Times New Roman"/>
+                <w:sz w:val="20"/>
+                <w:szCs w:val="20"/>
+              </w:rPr>
+              <w:t xml:space="preserve"> </w:t>
+            </w:r>
+            <w:r>
+              <w:rPr>
+                <w:rFonts w:ascii="Times New Roman" w:cs="Times New Roman" w:eastAsia="Times New Roman" w:hAnsi="Times New Roman"/>
+                <w:sz w:val="20"/>
+                <w:szCs w:val="20"/>
+              </w:rPr>
+              <w:t xml:space="preserve">☐ Usage</w:t>
             </w:r>
             <w:r>
               <w:rPr>
@@ -14855,23 +14891,7 @@
                 <w:sz w:val="20"/>
                 <w:szCs w:val="20"/>
               </w:rPr>
-              <w:t xml:space="preserve">X Usage</w:t>
-            </w:r>
-            <w:r>
-              <w:rPr>
-                <w:rFonts w:ascii="Times New Roman" w:cs="Times New Roman" w:eastAsia="Times New Roman" w:hAnsi="Times New Roman"/>
-                <w:sz w:val="20"/>
-                <w:szCs w:val="20"/>
-              </w:rPr>
-              <w:t xml:space="preserve"> </w:t>
-            </w:r>
-            <w:r>
-              <w:rPr>
-                <w:rFonts w:ascii="Times New Roman" w:cs="Times New Roman" w:eastAsia="Times New Roman" w:hAnsi="Times New Roman"/>
-                <w:sz w:val="20"/>
-                <w:szCs w:val="20"/>
-              </w:rPr>
-              <w:t xml:space="preserve">☐ Mauvais</w:t>
+              <w:t xml:space="preserve">X Mauvais</w:t>
             </w:r>
           </w:p>
         </w:tc>
@@ -14961,7 +14981,7 @@
                 <w:sz w:val="15"/>
                 <w:szCs w:val="15"/>
               </w:rPr>
-              <w:t xml:space="preserve">RAS</w:t>
+              <w:t xml:space="preserve">Déchirure large et profonde de l’assise ; déchirures sur les deux accoudoirs</w:t>
             </w:r>
           </w:p>
         </w:tc>
@@ -15024,7 +15044,7 @@
                 <w:sz w:val="20"/>
                 <w:szCs w:val="20"/>
               </w:rPr>
-              <w:t xml:space="preserve">Chaise de bureau</w:t>
+              <w:t xml:space="preserve">Coussin bordeaux sur chaise</w:t>
             </w:r>
           </w:p>
         </w:tc>
@@ -15046,38 +15066,6 @@
             <w:vAlign w:val="center"/>
           </w:tcPr>
           <w:p>
-            <w:r>
-              <w:rPr>
-                <w:rFonts w:ascii="Times New Roman" w:cs="Times New Roman" w:eastAsia="Times New Roman" w:hAnsi="Times New Roman"/>
-                <w:sz w:val="20"/>
-                <w:szCs w:val="20"/>
-              </w:rPr>
-              <w:t xml:space="preserve">☐ Bon</w:t>
-            </w:r>
-            <w:r>
-              <w:rPr>
-                <w:rFonts w:ascii="Times New Roman" w:cs="Times New Roman" w:eastAsia="Times New Roman" w:hAnsi="Times New Roman"/>
-                <w:sz w:val="20"/>
-                <w:szCs w:val="20"/>
-              </w:rPr>
-              <w:t xml:space="preserve"> </w:t>
-            </w:r>
-            <w:r>
-              <w:rPr>
-                <w:rFonts w:ascii="Times New Roman" w:cs="Times New Roman" w:eastAsia="Times New Roman" w:hAnsi="Times New Roman"/>
-                <w:sz w:val="20"/>
-                <w:szCs w:val="20"/>
-              </w:rPr>
-              <w:t xml:space="preserve">☐ Usage</w:t>
-            </w:r>
-            <w:r>
-              <w:rPr>
-                <w:rFonts w:ascii="Times New Roman" w:cs="Times New Roman" w:eastAsia="Times New Roman" w:hAnsi="Times New Roman"/>
-                <w:sz w:val="20"/>
-                <w:szCs w:val="20"/>
-              </w:rPr>
-              <w:t xml:space="preserve"> </w:t>
-            </w:r>
             <w:r>
               <w:rPr>
                 <w:rFonts w:ascii="Times New Roman" w:cs="Times New Roman" w:eastAsia="Times New Roman" w:hAnsi="Times New Roman"/>
@@ -15086,7 +15074,39 @@
                 <w:sz w:val="20"/>
                 <w:szCs w:val="20"/>
               </w:rPr>
-              <w:t xml:space="preserve">X Mauvais</w:t>
+              <w:t xml:space="preserve">X Bon</w:t>
+            </w:r>
+            <w:r>
+              <w:rPr>
+                <w:rFonts w:ascii="Times New Roman" w:cs="Times New Roman" w:eastAsia="Times New Roman" w:hAnsi="Times New Roman"/>
+                <w:sz w:val="20"/>
+                <w:szCs w:val="20"/>
+              </w:rPr>
+              <w:t xml:space="preserve"> </w:t>
+            </w:r>
+            <w:r>
+              <w:rPr>
+                <w:rFonts w:ascii="Times New Roman" w:cs="Times New Roman" w:eastAsia="Times New Roman" w:hAnsi="Times New Roman"/>
+                <w:sz w:val="20"/>
+                <w:szCs w:val="20"/>
+              </w:rPr>
+              <w:t xml:space="preserve">☐ Usage</w:t>
+            </w:r>
+            <w:r>
+              <w:rPr>
+                <w:rFonts w:ascii="Times New Roman" w:cs="Times New Roman" w:eastAsia="Times New Roman" w:hAnsi="Times New Roman"/>
+                <w:sz w:val="20"/>
+                <w:szCs w:val="20"/>
+              </w:rPr>
+              <w:t xml:space="preserve"> </w:t>
+            </w:r>
+            <w:r>
+              <w:rPr>
+                <w:rFonts w:ascii="Times New Roman" w:cs="Times New Roman" w:eastAsia="Times New Roman" w:hAnsi="Times New Roman"/>
+                <w:sz w:val="20"/>
+                <w:szCs w:val="20"/>
+              </w:rPr>
+              <w:t xml:space="preserve">☐ Mauvais</w:t>
             </w:r>
           </w:p>
         </w:tc>
@@ -15174,7 +15194,7 @@
                 <w:sz w:val="15"/>
                 <w:szCs w:val="15"/>
               </w:rPr>
-              <w:t xml:space="preserve">Déchirure large et profonde de l’assise ; déchirures sur les deux accoudoirs</w:t>
+              <w:t xml:space="preserve">RAS</w:t>
             </w:r>
           </w:p>
         </w:tc>
@@ -15239,7 +15259,7 @@
                 <w:sz w:val="20"/>
                 <w:szCs w:val="20"/>
               </w:rPr>
-              <w:t xml:space="preserve">Coussin bordeaux sur chaise</w:t>
+              <w:t xml:space="preserve">Meuble dressing</w:t>
             </w:r>
           </w:p>
         </w:tc>
@@ -15262,6 +15282,22 @@
             <w:vAlign w:val="center"/>
           </w:tcPr>
           <w:p>
+            <w:r>
+              <w:rPr>
+                <w:rFonts w:ascii="Times New Roman" w:cs="Times New Roman" w:eastAsia="Times New Roman" w:hAnsi="Times New Roman"/>
+                <w:sz w:val="20"/>
+                <w:szCs w:val="20"/>
+              </w:rPr>
+              <w:t xml:space="preserve">☐ Bon</w:t>
+            </w:r>
+            <w:r>
+              <w:rPr>
+                <w:rFonts w:ascii="Times New Roman" w:cs="Times New Roman" w:eastAsia="Times New Roman" w:hAnsi="Times New Roman"/>
+                <w:sz w:val="20"/>
+                <w:szCs w:val="20"/>
+              </w:rPr>
+              <w:t xml:space="preserve"> </w:t>
+            </w:r>
             <w:r>
               <w:rPr>
                 <w:rFonts w:ascii="Times New Roman" w:cs="Times New Roman" w:eastAsia="Times New Roman" w:hAnsi="Times New Roman"/>
@@ -15270,7 +15306,52 @@
                 <w:sz w:val="20"/>
                 <w:szCs w:val="20"/>
               </w:rPr>
-              <w:t xml:space="preserve">X Bon</w:t>
+              <w:t xml:space="preserve">X Usage</w:t>
+            </w:r>
+            <w:r>
+              <w:rPr>
+                <w:rFonts w:ascii="Times New Roman" w:cs="Times New Roman" w:eastAsia="Times New Roman" w:hAnsi="Times New Roman"/>
+                <w:sz w:val="20"/>
+                <w:szCs w:val="20"/>
+              </w:rPr>
+              <w:t xml:space="preserve"> </w:t>
+            </w:r>
+            <w:r>
+              <w:rPr>
+                <w:rFonts w:ascii="Times New Roman" w:cs="Times New Roman" w:eastAsia="Times New Roman" w:hAnsi="Times New Roman"/>
+                <w:sz w:val="20"/>
+                <w:szCs w:val="20"/>
+              </w:rPr>
+              <w:t xml:space="preserve">☐ Mauvais</w:t>
+            </w:r>
+          </w:p>
+        </w:tc>
+        <w:tc>
+          <w:tcPr>
+            <w:tcW w:type="dxa" w:w="2940"/>
+            <w:tcBorders>
+              <w:top w:val="single" w:color="A6A6A6" w:sz="4"/>
+              <w:left w:val="single" w:color="A6A6A6" w:sz="4"/>
+              <w:bottom w:val="single" w:color="A6A6A6" w:sz="4"/>
+              <w:right w:val="single" w:color="A6A6A6" w:sz="4"/>
+            </w:tcBorders>
+            <w:shd w:fill="F5F5F5" w:color="auto" w:val="clear"/>
+            <w:tcMar>
+              <w:top w:type="dxa" w:w="30"/>
+              <w:left w:type="dxa" w:w="60"/>
+              <w:bottom w:type="dxa" w:w="30"/>
+              <w:right w:type="dxa" w:w="60"/>
+            </w:tcMar>
+            <w:vAlign w:val="center"/>
+          </w:tcPr>
+          <w:p>
+            <w:r>
+              <w:rPr>
+                <w:rFonts w:ascii="Times New Roman" w:cs="Times New Roman" w:eastAsia="Times New Roman" w:hAnsi="Times New Roman"/>
+                <w:sz w:val="20"/>
+                <w:szCs w:val="20"/>
+              </w:rPr>
+              <w:t xml:space="preserve">☐ Bon</w:t>
             </w:r>
             <w:r>
               <w:rPr>
@@ -15308,67 +15389,6 @@
         </w:tc>
         <w:tc>
           <w:tcPr>
-            <w:tcW w:type="dxa" w:w="2940"/>
-            <w:tcBorders>
-              <w:top w:val="single" w:color="A6A6A6" w:sz="4"/>
-              <w:left w:val="single" w:color="A6A6A6" w:sz="4"/>
-              <w:bottom w:val="single" w:color="A6A6A6" w:sz="4"/>
-              <w:right w:val="single" w:color="A6A6A6" w:sz="4"/>
-            </w:tcBorders>
-            <w:shd w:fill="F5F5F5" w:color="auto" w:val="clear"/>
-            <w:tcMar>
-              <w:top w:type="dxa" w:w="30"/>
-              <w:left w:type="dxa" w:w="60"/>
-              <w:bottom w:type="dxa" w:w="30"/>
-              <w:right w:type="dxa" w:w="60"/>
-            </w:tcMar>
-            <w:vAlign w:val="center"/>
-          </w:tcPr>
-          <w:p>
-            <w:r>
-              <w:rPr>
-                <w:rFonts w:ascii="Times New Roman" w:cs="Times New Roman" w:eastAsia="Times New Roman" w:hAnsi="Times New Roman"/>
-                <w:sz w:val="20"/>
-                <w:szCs w:val="20"/>
-              </w:rPr>
-              <w:t xml:space="preserve">☐ Bon</w:t>
-            </w:r>
-            <w:r>
-              <w:rPr>
-                <w:rFonts w:ascii="Times New Roman" w:cs="Times New Roman" w:eastAsia="Times New Roman" w:hAnsi="Times New Roman"/>
-                <w:sz w:val="20"/>
-                <w:szCs w:val="20"/>
-              </w:rPr>
-              <w:t xml:space="preserve"> </w:t>
-            </w:r>
-            <w:r>
-              <w:rPr>
-                <w:rFonts w:ascii="Times New Roman" w:cs="Times New Roman" w:eastAsia="Times New Roman" w:hAnsi="Times New Roman"/>
-                <w:sz w:val="20"/>
-                <w:szCs w:val="20"/>
-              </w:rPr>
-              <w:t xml:space="preserve">☐ Usage</w:t>
-            </w:r>
-            <w:r>
-              <w:rPr>
-                <w:rFonts w:ascii="Times New Roman" w:cs="Times New Roman" w:eastAsia="Times New Roman" w:hAnsi="Times New Roman"/>
-                <w:sz w:val="20"/>
-                <w:szCs w:val="20"/>
-              </w:rPr>
-              <w:t xml:space="preserve"> </w:t>
-            </w:r>
-            <w:r>
-              <w:rPr>
-                <w:rFonts w:ascii="Times New Roman" w:cs="Times New Roman" w:eastAsia="Times New Roman" w:hAnsi="Times New Roman"/>
-                <w:sz w:val="20"/>
-                <w:szCs w:val="20"/>
-              </w:rPr>
-              <w:t xml:space="preserve">☐ Mauvais</w:t>
-            </w:r>
-          </w:p>
-        </w:tc>
-        <w:tc>
-          <w:tcPr>
             <w:tcW w:type="dxa" w:w="3360"/>
             <w:tcBorders>
               <w:top w:val="single" w:color="A6A6A6" w:sz="4"/>
@@ -15377,219 +15397,6 @@
               <w:right w:val="single" w:color="A6A6A6" w:sz="4"/>
             </w:tcBorders>
             <w:shd w:fill="F5F5F5" w:color="auto" w:val="clear"/>
-            <w:tcMar>
-              <w:top w:type="dxa" w:w="30"/>
-              <w:left w:type="dxa" w:w="60"/>
-              <w:bottom w:type="dxa" w:w="30"/>
-              <w:right w:type="dxa" w:w="60"/>
-            </w:tcMar>
-            <w:vAlign w:val="center"/>
-          </w:tcPr>
-          <w:p>
-            <w:r>
-              <w:rPr>
-                <w:rFonts w:ascii="Arial" w:cs="Arial" w:eastAsia="Arial" w:hAnsi="Arial"/>
-                <w:sz w:val="15"/>
-                <w:szCs w:val="15"/>
-              </w:rPr>
-              <w:t xml:space="preserve">RAS</w:t>
-            </w:r>
-          </w:p>
-        </w:tc>
-      </w:tr>
-      <w:tr>
-        <w:trPr>
-          <w:cantSplit/>
-        </w:trPr>
-        <w:tc>
-          <w:tcPr>
-            <w:tcW w:type="dxa" w:w="1500"/>
-            <w:tcBorders>
-              <w:top w:val="single" w:color="A6A6A6" w:sz="4"/>
-              <w:left w:val="single" w:color="A6A6A6" w:sz="4"/>
-              <w:bottom w:val="single" w:color="A6A6A6" w:sz="4"/>
-              <w:right w:val="single" w:color="A6A6A6" w:sz="4"/>
-            </w:tcBorders>
-            <w:tcMar>
-              <w:top w:type="dxa" w:w="30"/>
-              <w:left w:type="dxa" w:w="60"/>
-              <w:bottom w:type="dxa" w:w="30"/>
-              <w:right w:type="dxa" w:w="60"/>
-            </w:tcMar>
-            <w:vAlign w:val="center"/>
-          </w:tcPr>
-          <w:p>
-            <w:r>
-              <w:rPr>
-                <w:rFonts w:ascii="Times New Roman" w:cs="Times New Roman" w:eastAsia="Times New Roman" w:hAnsi="Times New Roman"/>
-                <w:b/>
-                <w:bCs/>
-                <w:sz w:val="20"/>
-                <w:szCs w:val="20"/>
-              </w:rPr>
-              <w:t xml:space="preserve"/>
-            </w:r>
-          </w:p>
-        </w:tc>
-        <w:tc>
-          <w:tcPr>
-            <w:tcW w:type="dxa" w:w="2160"/>
-            <w:tcBorders>
-              <w:top w:val="single" w:color="A6A6A6" w:sz="4"/>
-              <w:left w:val="single" w:color="A6A6A6" w:sz="4"/>
-              <w:bottom w:val="single" w:color="A6A6A6" w:sz="4"/>
-              <w:right w:val="single" w:color="A6A6A6" w:sz="4"/>
-            </w:tcBorders>
-            <w:tcMar>
-              <w:top w:type="dxa" w:w="30"/>
-              <w:left w:type="dxa" w:w="60"/>
-              <w:bottom w:type="dxa" w:w="30"/>
-              <w:right w:type="dxa" w:w="60"/>
-            </w:tcMar>
-            <w:vAlign w:val="center"/>
-          </w:tcPr>
-          <w:p>
-            <w:r>
-              <w:rPr>
-                <w:rFonts w:ascii="Times New Roman" w:cs="Times New Roman" w:eastAsia="Times New Roman" w:hAnsi="Times New Roman"/>
-                <w:sz w:val="20"/>
-                <w:szCs w:val="20"/>
-              </w:rPr>
-              <w:t xml:space="preserve">Meuble dressing</w:t>
-            </w:r>
-          </w:p>
-        </w:tc>
-        <w:tc>
-          <w:tcPr>
-            <w:tcW w:type="dxa" w:w="2940"/>
-            <w:tcBorders>
-              <w:top w:val="single" w:color="A6A6A6" w:sz="4"/>
-              <w:left w:val="single" w:color="A6A6A6" w:sz="4"/>
-              <w:bottom w:val="single" w:color="A6A6A6" w:sz="4"/>
-              <w:right w:val="single" w:color="A6A6A6" w:sz="4"/>
-            </w:tcBorders>
-            <w:tcMar>
-              <w:top w:type="dxa" w:w="30"/>
-              <w:left w:type="dxa" w:w="60"/>
-              <w:bottom w:type="dxa" w:w="30"/>
-              <w:right w:type="dxa" w:w="60"/>
-            </w:tcMar>
-            <w:vAlign w:val="center"/>
-          </w:tcPr>
-          <w:p>
-            <w:r>
-              <w:rPr>
-                <w:rFonts w:ascii="Times New Roman" w:cs="Times New Roman" w:eastAsia="Times New Roman" w:hAnsi="Times New Roman"/>
-                <w:sz w:val="20"/>
-                <w:szCs w:val="20"/>
-              </w:rPr>
-              <w:t xml:space="preserve">☐ Bon</w:t>
-            </w:r>
-            <w:r>
-              <w:rPr>
-                <w:rFonts w:ascii="Times New Roman" w:cs="Times New Roman" w:eastAsia="Times New Roman" w:hAnsi="Times New Roman"/>
-                <w:sz w:val="20"/>
-                <w:szCs w:val="20"/>
-              </w:rPr>
-              <w:t xml:space="preserve"> </w:t>
-            </w:r>
-            <w:r>
-              <w:rPr>
-                <w:rFonts w:ascii="Times New Roman" w:cs="Times New Roman" w:eastAsia="Times New Roman" w:hAnsi="Times New Roman"/>
-                <w:b/>
-                <w:bCs/>
-                <w:sz w:val="20"/>
-                <w:szCs w:val="20"/>
-              </w:rPr>
-              <w:t xml:space="preserve">X Usage</w:t>
-            </w:r>
-            <w:r>
-              <w:rPr>
-                <w:rFonts w:ascii="Times New Roman" w:cs="Times New Roman" w:eastAsia="Times New Roman" w:hAnsi="Times New Roman"/>
-                <w:sz w:val="20"/>
-                <w:szCs w:val="20"/>
-              </w:rPr>
-              <w:t xml:space="preserve"> </w:t>
-            </w:r>
-            <w:r>
-              <w:rPr>
-                <w:rFonts w:ascii="Times New Roman" w:cs="Times New Roman" w:eastAsia="Times New Roman" w:hAnsi="Times New Roman"/>
-                <w:sz w:val="20"/>
-                <w:szCs w:val="20"/>
-              </w:rPr>
-              <w:t xml:space="preserve">☐ Mauvais</w:t>
-            </w:r>
-          </w:p>
-        </w:tc>
-        <w:tc>
-          <w:tcPr>
-            <w:tcW w:type="dxa" w:w="2940"/>
-            <w:tcBorders>
-              <w:top w:val="single" w:color="A6A6A6" w:sz="4"/>
-              <w:left w:val="single" w:color="A6A6A6" w:sz="4"/>
-              <w:bottom w:val="single" w:color="A6A6A6" w:sz="4"/>
-              <w:right w:val="single" w:color="A6A6A6" w:sz="4"/>
-            </w:tcBorders>
-            <w:tcMar>
-              <w:top w:type="dxa" w:w="30"/>
-              <w:left w:type="dxa" w:w="60"/>
-              <w:bottom w:type="dxa" w:w="30"/>
-              <w:right w:type="dxa" w:w="60"/>
-            </w:tcMar>
-            <w:vAlign w:val="center"/>
-          </w:tcPr>
-          <w:p>
-            <w:r>
-              <w:rPr>
-                <w:rFonts w:ascii="Times New Roman" w:cs="Times New Roman" w:eastAsia="Times New Roman" w:hAnsi="Times New Roman"/>
-                <w:sz w:val="20"/>
-                <w:szCs w:val="20"/>
-              </w:rPr>
-              <w:t xml:space="preserve">☐ Bon</w:t>
-            </w:r>
-            <w:r>
-              <w:rPr>
-                <w:rFonts w:ascii="Times New Roman" w:cs="Times New Roman" w:eastAsia="Times New Roman" w:hAnsi="Times New Roman"/>
-                <w:sz w:val="20"/>
-                <w:szCs w:val="20"/>
-              </w:rPr>
-              <w:t xml:space="preserve"> </w:t>
-            </w:r>
-            <w:r>
-              <w:rPr>
-                <w:rFonts w:ascii="Times New Roman" w:cs="Times New Roman" w:eastAsia="Times New Roman" w:hAnsi="Times New Roman"/>
-                <w:sz w:val="20"/>
-                <w:szCs w:val="20"/>
-              </w:rPr>
-              <w:t xml:space="preserve">☐ Usage</w:t>
-            </w:r>
-            <w:r>
-              <w:rPr>
-                <w:rFonts w:ascii="Times New Roman" w:cs="Times New Roman" w:eastAsia="Times New Roman" w:hAnsi="Times New Roman"/>
-                <w:sz w:val="20"/>
-                <w:szCs w:val="20"/>
-              </w:rPr>
-              <w:t xml:space="preserve"> </w:t>
-            </w:r>
-            <w:r>
-              <w:rPr>
-                <w:rFonts w:ascii="Times New Roman" w:cs="Times New Roman" w:eastAsia="Times New Roman" w:hAnsi="Times New Roman"/>
-                <w:sz w:val="20"/>
-                <w:szCs w:val="20"/>
-              </w:rPr>
-              <w:t xml:space="preserve">☐ Mauvais</w:t>
-            </w:r>
-          </w:p>
-        </w:tc>
-        <w:tc>
-          <w:tcPr>
-            <w:tcW w:type="dxa" w:w="3360"/>
-            <w:tcBorders>
-              <w:top w:val="single" w:color="A6A6A6" w:sz="4"/>
-              <w:left w:val="single" w:color="A6A6A6" w:sz="4"/>
-              <w:bottom w:val="single" w:color="A6A6A6" w:sz="4"/>
-              <w:right w:val="single" w:color="A6A6A6" w:sz="4"/>
-            </w:tcBorders>
             <w:tcMar>
               <w:top w:type="dxa" w:w="30"/>
               <w:left w:type="dxa" w:w="60"/>
@@ -18064,7 +17871,7 @@
                 <w:sz w:val="22"/>
                 <w:szCs w:val="22"/>
               </w:rPr>
-              <w:t xml:space="preserve">Clé chambre 2 (côté sdb) : 1</w:t>
+              <w:t xml:space="preserve">Clé chambre : 1</w:t>
             </w:r>
           </w:p>
           <w:p>
@@ -18169,7 +17976,7 @@
                 <w:sz w:val="22"/>
                 <w:szCs w:val="22"/>
               </w:rPr>
-              <w:t xml:space="preserve">Clé chambre 1 (côté salon) : 1</w:t>
+              <w:t xml:space="preserve">Clé chambre : 1</w:t>
             </w:r>
           </w:p>
           <w:p>
@@ -18205,7 +18012,7 @@
                 <w:sz w:val="22"/>
                 <w:szCs w:val="22"/>
               </w:rPr>
-              <w:t xml:space="preserve">Badge résidence : 1</w:t>
+              <w:t xml:space="preserve">Badge piétons résidence : 1</w:t>
             </w:r>
           </w:p>
           <w:p>
@@ -18223,7 +18030,7 @@
                 <w:sz w:val="22"/>
                 <w:szCs w:val="22"/>
               </w:rPr>
-              <w:t xml:space="preserve">Clé local à vélos : 1 (tordue/déformée)</w:t>
+              <w:t xml:space="preserve">Clé local à vélos : 1 (tordue mais fonctionnelle)</w:t>
             </w:r>
           </w:p>
           <w:p>
@@ -18274,7 +18081,7 @@
                 <w:sz w:val="20"/>
                 <w:szCs w:val="20"/>
               </w:rPr>
-              <w:t xml:space="preserve">Appartement très bien entretenu, propre. Robinet neuf et parquet ciré.</w:t>
+              <w:t xml:space="preserve">Appartement meublé, très bien entretenu, propre.</w:t>
             </w:r>
           </w:p>
           <w:p>
@@ -18287,7 +18094,7 @@
                 <w:sz w:val="20"/>
                 <w:szCs w:val="20"/>
               </w:rPr>
-              <w:t xml:space="preserve">La chambre 1 (côté salon) est remise dans l’état constaté lors de l’état des lieux de sortie du précédent occupant (28/08/2026), détaillé ci-dessus.</w:t>
+              <w:t xml:space="preserve">Des photos et vidéos de l’ensemble de l’appartement ont été prises lors de l’état des lieux d’entrée. Elles complètent le présent document et serviront de référence lors de l’état des lieux de sortie, notamment pour l’état des murs, des sols et des plafonds.</w:t>
             </w:r>
           </w:p>
         </w:tc>

</xml_diff>